<commit_message>
Auto-deploy static site to gh-pages branch
</commit_message>
<xml_diff>
--- a/assets/Шаблон_Отчета_УП0401.docx
+++ b/assets/Шаблон_Отчета_УП0401.docx
@@ -1,10 +1,12 @@
 
 <file path=word/document.xml><?xml version="1.0" encoding="utf-8"?>
-<w:document xmlns:ns1="http://schemas.openxmlformats.org/markup-compatibility/2006" xmlns:w="http://schemas.openxmlformats.org/wordprocessingml/2006/main" ns1:Ignorable="w14 wp14">
+<w:document xmlns:ns1="http://schemas.openxmlformats.org/markup-compatibility/2006" xmlns:ns2="http://schemas.openxmlformats.org/officeDocument/2006/relationships" xmlns:w="http://schemas.openxmlformats.org/wordprocessingml/2006/main" ns1:Ignorable="w14 wp14">
   <w:body>
     <w:p>
       <w:pPr>
-        <w:pStyle w:val="HeaderMain"/>
+        <w:pStyle w:val="Heading1"/>
+        <w:spacing w:line="360" w:lineRule="auto" w:before="240" w:after="240"/>
+        <w:ind w:firstLine="0"/>
         <w:jc w:val="center"/>
       </w:pPr>
       <w:r>
@@ -19,7 +21,6 @@
     </w:p>
     <w:p>
       <w:pPr>
-        <w:pStyle w:val="ParagraphMain"/>
         <w:spacing w:line="360" w:lineRule="auto" w:before="0" w:after="0"/>
         <w:ind w:firstLine="0"/>
         <w:jc w:val="both"/>
@@ -27,6 +28,7 @@
       <w:r>
         <w:rPr>
           <w:rFonts w:ascii="Times New Roman" w:hAnsi="Times New Roman"/>
+          <w:i w:val="0"/>
           <w:color w:val="000000"/>
           <w:sz w:val="28"/>
         </w:rPr>
@@ -35,7 +37,6 @@
     </w:p>
     <w:p>
       <w:pPr>
-        <w:pStyle w:val="ParagraphMain"/>
         <w:spacing w:line="360" w:lineRule="auto" w:before="0" w:after="0"/>
         <w:ind w:firstLine="0"/>
         <w:jc w:val="both"/>
@@ -43,6 +44,7 @@
       <w:r>
         <w:rPr>
           <w:rFonts w:ascii="Times New Roman" w:hAnsi="Times New Roman"/>
+          <w:i w:val="0"/>
           <w:color w:val="000000"/>
           <w:sz w:val="28"/>
         </w:rPr>
@@ -51,7 +53,6 @@
     </w:p>
     <w:p>
       <w:pPr>
-        <w:pStyle w:val="ParagraphMain"/>
         <w:spacing w:line="360" w:lineRule="auto" w:before="0" w:after="0"/>
         <w:ind w:firstLine="0"/>
         <w:jc w:val="both"/>
@@ -59,6 +60,7 @@
       <w:r>
         <w:rPr>
           <w:rFonts w:ascii="Times New Roman" w:hAnsi="Times New Roman"/>
+          <w:i w:val="0"/>
           <w:color w:val="000000"/>
           <w:sz w:val="28"/>
         </w:rPr>
@@ -67,7 +69,6 @@
     </w:p>
     <w:p>
       <w:pPr>
-        <w:pStyle w:val="ParagraphMain"/>
         <w:spacing w:line="360" w:lineRule="auto" w:before="0" w:after="0"/>
         <w:ind w:firstLine="0"/>
         <w:jc w:val="both"/>
@@ -75,6 +76,7 @@
       <w:r>
         <w:rPr>
           <w:rFonts w:ascii="Times New Roman" w:hAnsi="Times New Roman"/>
+          <w:i w:val="0"/>
           <w:color w:val="000000"/>
           <w:sz w:val="28"/>
         </w:rPr>
@@ -83,7 +85,6 @@
     </w:p>
     <w:p>
       <w:pPr>
-        <w:pStyle w:val="ParagraphMain"/>
         <w:spacing w:line="360" w:lineRule="auto" w:before="0" w:after="0"/>
         <w:ind w:firstLine="0"/>
         <w:jc w:val="both"/>
@@ -91,6 +92,7 @@
       <w:r>
         <w:rPr>
           <w:rFonts w:ascii="Times New Roman" w:hAnsi="Times New Roman"/>
+          <w:i w:val="0"/>
           <w:color w:val="000000"/>
           <w:sz w:val="28"/>
         </w:rPr>
@@ -99,7 +101,6 @@
     </w:p>
     <w:p>
       <w:pPr>
-        <w:pStyle w:val="ParagraphMain"/>
         <w:spacing w:line="360" w:lineRule="auto" w:before="0" w:after="0"/>
         <w:ind w:firstLine="0"/>
         <w:jc w:val="both"/>
@@ -107,6 +108,7 @@
       <w:r>
         <w:rPr>
           <w:rFonts w:ascii="Times New Roman" w:hAnsi="Times New Roman"/>
+          <w:i w:val="0"/>
           <w:color w:val="000000"/>
           <w:sz w:val="28"/>
         </w:rPr>
@@ -115,7 +117,6 @@
     </w:p>
     <w:p>
       <w:pPr>
-        <w:pStyle w:val="ParagraphMain"/>
         <w:spacing w:line="360" w:lineRule="auto" w:before="0" w:after="0"/>
         <w:ind w:firstLine="0"/>
         <w:jc w:val="both"/>
@@ -123,6 +124,7 @@
       <w:r>
         <w:rPr>
           <w:rFonts w:ascii="Times New Roman" w:hAnsi="Times New Roman"/>
+          <w:i w:val="0"/>
           <w:color w:val="000000"/>
           <w:sz w:val="28"/>
         </w:rPr>
@@ -131,7 +133,6 @@
     </w:p>
     <w:p>
       <w:pPr>
-        <w:pStyle w:val="ParagraphMain"/>
         <w:spacing w:line="360" w:lineRule="auto" w:before="0" w:after="0"/>
         <w:ind w:firstLine="0"/>
         <w:jc w:val="both"/>
@@ -139,6 +140,7 @@
       <w:r>
         <w:rPr>
           <w:rFonts w:ascii="Times New Roman" w:hAnsi="Times New Roman"/>
+          <w:i w:val="0"/>
           <w:color w:val="000000"/>
           <w:sz w:val="28"/>
         </w:rPr>
@@ -147,7 +149,6 @@
     </w:p>
     <w:p>
       <w:pPr>
-        <w:pStyle w:val="ParagraphMain"/>
         <w:spacing w:line="360" w:lineRule="auto" w:before="0" w:after="0"/>
         <w:ind w:firstLine="0"/>
         <w:jc w:val="both"/>
@@ -155,6 +156,7 @@
       <w:r>
         <w:rPr>
           <w:rFonts w:ascii="Times New Roman" w:hAnsi="Times New Roman"/>
+          <w:i w:val="0"/>
           <w:color w:val="000000"/>
           <w:sz w:val="28"/>
         </w:rPr>
@@ -163,7 +165,6 @@
     </w:p>
     <w:p>
       <w:pPr>
-        <w:pStyle w:val="ParagraphMain"/>
         <w:spacing w:line="360" w:lineRule="auto" w:before="0" w:after="0"/>
         <w:ind w:firstLine="0"/>
         <w:jc w:val="both"/>
@@ -171,6 +172,7 @@
       <w:r>
         <w:rPr>
           <w:rFonts w:ascii="Times New Roman" w:hAnsi="Times New Roman"/>
+          <w:i w:val="0"/>
           <w:color w:val="000000"/>
           <w:sz w:val="28"/>
         </w:rPr>
@@ -179,7 +181,6 @@
     </w:p>
     <w:p>
       <w:pPr>
-        <w:pStyle w:val="ParagraphMain"/>
         <w:spacing w:line="360" w:lineRule="auto" w:before="0" w:after="0"/>
         <w:ind w:firstLine="0"/>
         <w:jc w:val="both"/>
@@ -187,6 +188,7 @@
       <w:r>
         <w:rPr>
           <w:rFonts w:ascii="Times New Roman" w:hAnsi="Times New Roman"/>
+          <w:i w:val="0"/>
           <w:color w:val="000000"/>
           <w:sz w:val="28"/>
         </w:rPr>
@@ -195,7 +197,6 @@
     </w:p>
     <w:p>
       <w:pPr>
-        <w:pStyle w:val="ParagraphMain"/>
         <w:spacing w:line="360" w:lineRule="auto" w:before="0" w:after="0"/>
         <w:ind w:firstLine="0"/>
         <w:jc w:val="both"/>
@@ -203,6 +204,7 @@
       <w:r>
         <w:rPr>
           <w:rFonts w:ascii="Times New Roman" w:hAnsi="Times New Roman"/>
+          <w:i w:val="0"/>
           <w:color w:val="000000"/>
           <w:sz w:val="28"/>
         </w:rPr>
@@ -211,7 +213,6 @@
     </w:p>
     <w:p>
       <w:pPr>
-        <w:pStyle w:val="ParagraphMain"/>
         <w:spacing w:line="360" w:lineRule="auto" w:before="0" w:after="0"/>
         <w:ind w:firstLine="0"/>
         <w:jc w:val="both"/>
@@ -219,6 +220,7 @@
       <w:r>
         <w:rPr>
           <w:rFonts w:ascii="Times New Roman" w:hAnsi="Times New Roman"/>
+          <w:i w:val="0"/>
           <w:color w:val="000000"/>
           <w:sz w:val="28"/>
         </w:rPr>
@@ -227,7 +229,6 @@
     </w:p>
     <w:p>
       <w:pPr>
-        <w:pStyle w:val="ParagraphMain"/>
         <w:spacing w:line="360" w:lineRule="auto" w:before="0" w:after="0"/>
         <w:ind w:firstLine="0"/>
         <w:jc w:val="both"/>
@@ -235,6 +236,7 @@
       <w:r>
         <w:rPr>
           <w:rFonts w:ascii="Times New Roman" w:hAnsi="Times New Roman"/>
+          <w:i w:val="0"/>
           <w:color w:val="000000"/>
           <w:sz w:val="28"/>
         </w:rPr>
@@ -243,7 +245,6 @@
     </w:p>
     <w:p>
       <w:pPr>
-        <w:pStyle w:val="ParagraphMain"/>
         <w:spacing w:line="360" w:lineRule="auto" w:before="0" w:after="0"/>
         <w:ind w:firstLine="0"/>
         <w:jc w:val="both"/>
@@ -251,6 +252,7 @@
       <w:r>
         <w:rPr>
           <w:rFonts w:ascii="Times New Roman" w:hAnsi="Times New Roman"/>
+          <w:i w:val="0"/>
           <w:color w:val="000000"/>
           <w:sz w:val="28"/>
         </w:rPr>
@@ -259,7 +261,6 @@
     </w:p>
     <w:p>
       <w:pPr>
-        <w:pStyle w:val="ParagraphMain"/>
         <w:spacing w:line="360" w:lineRule="auto" w:before="0" w:after="0"/>
         <w:ind w:firstLine="0"/>
         <w:jc w:val="both"/>
@@ -267,6 +268,7 @@
       <w:r>
         <w:rPr>
           <w:rFonts w:ascii="Times New Roman" w:hAnsi="Times New Roman"/>
+          <w:i w:val="0"/>
           <w:color w:val="000000"/>
           <w:sz w:val="28"/>
         </w:rPr>
@@ -275,7 +277,6 @@
     </w:p>
     <w:p>
       <w:pPr>
-        <w:pStyle w:val="ParagraphMain"/>
         <w:spacing w:line="360" w:lineRule="auto" w:before="0" w:after="0"/>
         <w:ind w:firstLine="0"/>
         <w:jc w:val="both"/>
@@ -283,6 +284,7 @@
       <w:r>
         <w:rPr>
           <w:rFonts w:ascii="Times New Roman" w:hAnsi="Times New Roman"/>
+          <w:i w:val="0"/>
           <w:color w:val="000000"/>
           <w:sz w:val="28"/>
         </w:rPr>
@@ -291,7 +293,6 @@
     </w:p>
     <w:p>
       <w:pPr>
-        <w:pStyle w:val="ParagraphMain"/>
         <w:spacing w:line="360" w:lineRule="auto" w:before="0" w:after="0"/>
         <w:ind w:firstLine="0"/>
         <w:jc w:val="both"/>
@@ -299,6 +300,7 @@
       <w:r>
         <w:rPr>
           <w:rFonts w:ascii="Times New Roman" w:hAnsi="Times New Roman"/>
+          <w:i w:val="0"/>
           <w:color w:val="000000"/>
           <w:sz w:val="28"/>
         </w:rPr>
@@ -307,7 +309,6 @@
     </w:p>
     <w:p>
       <w:pPr>
-        <w:pStyle w:val="ParagraphMain"/>
         <w:spacing w:line="360" w:lineRule="auto" w:before="0" w:after="0"/>
         <w:ind w:firstLine="0"/>
         <w:jc w:val="both"/>
@@ -315,6 +316,7 @@
       <w:r>
         <w:rPr>
           <w:rFonts w:ascii="Times New Roman" w:hAnsi="Times New Roman"/>
+          <w:i w:val="0"/>
           <w:color w:val="000000"/>
           <w:sz w:val="28"/>
         </w:rPr>
@@ -323,7 +325,6 @@
     </w:p>
     <w:p>
       <w:pPr>
-        <w:pStyle w:val="ParagraphMain"/>
         <w:spacing w:line="360" w:lineRule="auto" w:before="0" w:after="0"/>
         <w:ind w:firstLine="0"/>
         <w:jc w:val="both"/>
@@ -331,6 +332,7 @@
       <w:r>
         <w:rPr>
           <w:rFonts w:ascii="Times New Roman" w:hAnsi="Times New Roman"/>
+          <w:i w:val="0"/>
           <w:color w:val="000000"/>
           <w:sz w:val="28"/>
         </w:rPr>
@@ -339,8 +341,10 @@
     </w:p>
     <w:p>
       <w:pPr>
-        <w:pStyle w:val="HeaderMain"/>
+        <w:pStyle w:val="Heading1"/>
         <w:pageBreakBefore/>
+        <w:spacing w:line="360" w:lineRule="auto" w:before="240" w:after="240"/>
+        <w:ind w:firstLine="0"/>
         <w:jc w:val="center"/>
       </w:pPr>
       <w:r>
@@ -355,7 +359,8 @@
     </w:p>
     <w:p>
       <w:pPr>
-        <w:pStyle w:val="ParagraphMain"/>
+        <w:spacing w:line="360" w:lineRule="auto" w:before="0" w:after="0"/>
+        <w:ind w:firstLine="709"/>
         <w:jc w:val="both"/>
       </w:pPr>
       <w:r>
@@ -370,7 +375,8 @@
     </w:p>
     <w:p>
       <w:pPr>
-        <w:pStyle w:val="ParagraphMain"/>
+        <w:spacing w:line="360" w:lineRule="auto" w:before="0" w:after="0"/>
+        <w:ind w:firstLine="709"/>
         <w:jc w:val="both"/>
       </w:pPr>
       <w:r>
@@ -385,7 +391,9 @@
     </w:p>
     <w:p>
       <w:pPr>
-        <w:pStyle w:val="ListMain"/>
+        <w:pStyle w:val="ListParagraph"/>
+        <w:spacing w:line="360" w:lineRule="auto" w:before="0" w:after="0"/>
+        <w:ind w:firstLine="709"/>
         <w:jc w:val="both"/>
       </w:pPr>
       <w:r>
@@ -395,12 +403,14 @@
           <w:color w:val="000000"/>
           <w:sz w:val="28"/>
         </w:rPr>
-        <w:t>• Язык разработки и платформа: C# (.NET Framework 4.8);</w:t>
+        <w:t>— Язык разработки и платформа: C# (.NET Framework 4.8);</w:t>
       </w:r>
     </w:p>
     <w:p>
       <w:pPr>
-        <w:pStyle w:val="ListMain"/>
+        <w:pStyle w:val="ListParagraph"/>
+        <w:spacing w:line="360" w:lineRule="auto" w:before="0" w:after="0"/>
+        <w:ind w:firstLine="709"/>
         <w:jc w:val="both"/>
       </w:pPr>
       <w:r>
@@ -410,12 +420,14 @@
           <w:color w:val="000000"/>
           <w:sz w:val="28"/>
         </w:rPr>
-        <w:t>• Графический интерфейс пользователя: Windows Forms с интеграцией библиотеки компонентов MaterialSkin.2 (стандарт Material3: MaterialForm, MaterialCard, MaterialTextBox, MaterialButton, MaterialComboBox, MaterialListView);</w:t>
+        <w:t>— Графический интерфейс пользователя: Windows Forms с интеграцией библиотеки компонентов MaterialSkin.2 (стандарт Material3: MaterialForm, MaterialCard, MaterialTextBox, MaterialButton, MaterialComboBox, MaterialListView);</w:t>
       </w:r>
     </w:p>
     <w:p>
       <w:pPr>
-        <w:pStyle w:val="ListMain"/>
+        <w:pStyle w:val="ListParagraph"/>
+        <w:spacing w:line="360" w:lineRule="auto" w:before="0" w:after="0"/>
+        <w:ind w:firstLine="709"/>
         <w:jc w:val="both"/>
       </w:pPr>
       <w:r>
@@ -425,12 +437,14 @@
           <w:color w:val="000000"/>
           <w:sz w:val="28"/>
         </w:rPr>
-        <w:t>• Реляционная СУБД: Microsoft SQL Server Express (экземпляр SQLEXPRESS) под управлением SQL Server Management Studio (SSMS);</w:t>
+        <w:t>— Реляционная СУБД: Microsoft SQL Server Express (экземпляр SQLEXPRESS) под управлением SQL Server Management Studio (SSMS);</w:t>
       </w:r>
     </w:p>
     <w:p>
       <w:pPr>
-        <w:pStyle w:val="ListMain"/>
+        <w:pStyle w:val="ListParagraph"/>
+        <w:spacing w:line="360" w:lineRule="auto" w:before="0" w:after="0"/>
+        <w:ind w:firstLine="709"/>
         <w:jc w:val="both"/>
       </w:pPr>
       <w:r>
@@ -440,12 +454,14 @@
           <w:color w:val="000000"/>
           <w:sz w:val="28"/>
         </w:rPr>
-        <w:t>• Слой доступа к данным: типизированный DataSet с визуальным дизайнером XML Schema Definition (.xsd) и TableAdapter/TableAdapterManager;</w:t>
+        <w:t>— Слой доступа к данным: типизированный DataSet с визуальным дизайнером XML Schema Definition (.xsd) и TableAdapter/TableAdapterManager;</w:t>
       </w:r>
     </w:p>
     <w:p>
       <w:pPr>
-        <w:pStyle w:val="ListMain"/>
+        <w:pStyle w:val="ListParagraph"/>
+        <w:spacing w:line="360" w:lineRule="auto" w:before="0" w:after="0"/>
+        <w:ind w:firstLine="709"/>
         <w:jc w:val="both"/>
       </w:pPr>
       <w:r>
@@ -455,12 +471,14 @@
           <w:color w:val="000000"/>
           <w:sz w:val="28"/>
         </w:rPr>
-        <w:t>• Система контроля версий: распределенная система Git (локальный репозиторий, структурированные коммиты, изолированные функциональные ветки feature-ветвления и слияния);</w:t>
+        <w:t>— Система контроля версий: распределенная система Git (локальный репозиторий, структурированные коммиты, изолированные функциональные ветки feature-ветвления и слияния);</w:t>
       </w:r>
     </w:p>
     <w:p>
       <w:pPr>
-        <w:pStyle w:val="ListMain"/>
+        <w:pStyle w:val="ListParagraph"/>
+        <w:spacing w:line="360" w:lineRule="auto" w:before="0" w:after="0"/>
+        <w:ind w:firstLine="709"/>
         <w:jc w:val="both"/>
       </w:pPr>
       <w:r>
@@ -470,12 +488,13 @@
           <w:color w:val="000000"/>
           <w:sz w:val="28"/>
         </w:rPr>
-        <w:t>• Подсистемы безопасности и надежности: криптографический модуль симметричного блочного шифрования файлов AES-256, хэширование паролей пользователей SHA-256 с добавлением соли (salt), автоматизированный бэкап и восстановление базы данных (.bak).</w:t>
+        <w:t>— Подсистемы безопасности и надежности: криптографический модуль симметричного блочного шифрования файлов AES-256, хэширование паролей пользователей SHA-256 с добавлением соли (salt), автоматизированный бэкап и восстановление базы данных (.bak).</w:t>
       </w:r>
     </w:p>
     <w:p>
       <w:pPr>
-        <w:pStyle w:val="ParagraphMain"/>
+        <w:spacing w:line="360" w:lineRule="auto" w:before="0" w:after="0"/>
+        <w:ind w:firstLine="709"/>
         <w:jc w:val="both"/>
       </w:pPr>
       <w:r>
@@ -490,7 +509,8 @@
     </w:p>
     <w:p>
       <w:pPr>
-        <w:pStyle w:val="Picturemain"/>
+        <w:spacing w:line="360" w:lineRule="auto" w:before="120" w:after="120"/>
+        <w:ind w:firstLine="0"/>
         <w:jc w:val="center"/>
       </w:pPr>
       <w:r>
@@ -507,8 +527,10 @@
     </w:p>
     <w:p>
       <w:pPr>
-        <w:pStyle w:val="HeaderMain"/>
+        <w:pStyle w:val="Heading1"/>
         <w:pageBreakBefore/>
+        <w:spacing w:line="360" w:lineRule="auto" w:before="240" w:after="240"/>
+        <w:ind w:firstLine="0"/>
         <w:jc w:val="center"/>
       </w:pPr>
       <w:r>
@@ -523,7 +545,9 @@
     </w:p>
     <w:p>
       <w:pPr>
-        <w:pStyle w:val="Headerlower"/>
+        <w:pStyle w:val="Heading2"/>
+        <w:spacing w:line="360" w:lineRule="auto" w:before="120" w:after="0"/>
+        <w:ind w:firstLine="709"/>
         <w:jc w:val="both"/>
       </w:pPr>
       <w:r>
@@ -538,7 +562,8 @@
     </w:p>
     <w:p>
       <w:pPr>
-        <w:pStyle w:val="ParagraphMain"/>
+        <w:spacing w:line="360" w:lineRule="auto" w:before="0" w:after="0"/>
+        <w:ind w:firstLine="709"/>
         <w:jc w:val="both"/>
       </w:pPr>
       <w:r>
@@ -553,7 +578,9 @@
     </w:p>
     <w:p>
       <w:pPr>
-        <w:pStyle w:val="Headerlower"/>
+        <w:pStyle w:val="Heading2"/>
+        <w:spacing w:line="360" w:lineRule="auto" w:before="120" w:after="0"/>
+        <w:ind w:firstLine="709"/>
         <w:jc w:val="both"/>
       </w:pPr>
       <w:r>
@@ -568,7 +595,9 @@
     </w:p>
     <w:p>
       <w:pPr>
-        <w:pStyle w:val="ListMain"/>
+        <w:pStyle w:val="ListParagraph"/>
+        <w:spacing w:line="360" w:lineRule="auto" w:before="0" w:after="0"/>
+        <w:ind w:firstLine="709"/>
         <w:jc w:val="both"/>
       </w:pPr>
       <w:r>
@@ -578,12 +607,14 @@
           <w:color w:val="000000"/>
           <w:sz w:val="28"/>
         </w:rPr>
-        <w:t>• Изучение требований правил техники безопасности, электробезопасности и санитарных правил (СанПиН 1.2.3685-21) при длительной разработке ПО за компьютером.</w:t>
+        <w:t>— Изучение требований правил техники безопасности, электробезопасности и санитарных правил (СанПиН 1.2.3685-21) при длительной разработке ПО за компьютером.</w:t>
       </w:r>
     </w:p>
     <w:p>
       <w:pPr>
-        <w:pStyle w:val="ListMain"/>
+        <w:pStyle w:val="ListParagraph"/>
+        <w:spacing w:line="360" w:lineRule="auto" w:before="0" w:after="0"/>
+        <w:ind w:firstLine="709"/>
         <w:jc w:val="both"/>
       </w:pPr>
       <w:r>
@@ -593,12 +624,14 @@
           <w:color w:val="000000"/>
           <w:sz w:val="28"/>
         </w:rPr>
-        <w:t>• Аппаратная спецификация инженерного рабочего места (характеристики монитора, системного блока, накопителей и периферии).</w:t>
+        <w:t>— Аппаратная спецификация инженерного рабочего места (характеристики монитора, системного блока, накопителей и периферии).</w:t>
       </w:r>
     </w:p>
     <w:p>
       <w:pPr>
-        <w:pStyle w:val="ListMain"/>
+        <w:pStyle w:val="ListParagraph"/>
+        <w:spacing w:line="360" w:lineRule="auto" w:before="0" w:after="0"/>
+        <w:ind w:firstLine="709"/>
         <w:jc w:val="both"/>
       </w:pPr>
       <w:r>
@@ -608,12 +641,14 @@
           <w:color w:val="000000"/>
           <w:sz w:val="28"/>
         </w:rPr>
-        <w:t>• Развертывание и аудит среды: Microsoft Visual Studio 2022, .NET Framework 4.8, подключение NuGet-пакета MaterialSkin.2.</w:t>
+        <w:t>— Развертывание и аудит среды: Microsoft Visual Studio 2022, .NET Framework 4.8, подключение NuGet-пакета MaterialSkin.2.</w:t>
       </w:r>
     </w:p>
     <w:p>
       <w:pPr>
-        <w:pStyle w:val="ListMain"/>
+        <w:pStyle w:val="ListParagraph"/>
+        <w:spacing w:line="360" w:lineRule="auto" w:before="0" w:after="0"/>
+        <w:ind w:firstLine="709"/>
         <w:jc w:val="both"/>
       </w:pPr>
       <w:r>
@@ -623,12 +658,14 @@
           <w:color w:val="000000"/>
           <w:sz w:val="28"/>
         </w:rPr>
-        <w:t>• Выбор и фиксация индивидуальной темы ИС из 15 вариантов, составление перечня 6 ключевых сущностей БД.</w:t>
+        <w:t>— Выбор и фиксация индивидуальной темы ИС из 15 вариантов, составление перечня 6 ключевых сущностей БД.</w:t>
       </w:r>
     </w:p>
     <w:p>
       <w:pPr>
-        <w:pStyle w:val="Headerlower"/>
+        <w:pStyle w:val="Heading2"/>
+        <w:spacing w:line="360" w:lineRule="auto" w:before="120" w:after="0"/>
+        <w:ind w:firstLine="709"/>
         <w:jc w:val="both"/>
       </w:pPr>
       <w:r>
@@ -643,7 +680,8 @@
     </w:p>
     <w:p>
       <w:pPr>
-        <w:pStyle w:val="Picturemain"/>
+        <w:spacing w:line="360" w:lineRule="auto" w:before="120" w:after="120"/>
+        <w:ind w:firstLine="0"/>
         <w:jc w:val="center"/>
       </w:pPr>
       <w:r>
@@ -660,7 +698,9 @@
     </w:p>
     <w:p>
       <w:pPr>
-        <w:pStyle w:val="Headerlower"/>
+        <w:pStyle w:val="Heading2"/>
+        <w:spacing w:line="360" w:lineRule="auto" w:before="120" w:after="0"/>
+        <w:ind w:firstLine="709"/>
         <w:jc w:val="both"/>
       </w:pPr>
       <w:r>
@@ -675,7 +715,8 @@
     </w:p>
     <w:p>
       <w:pPr>
-        <w:pStyle w:val="ParagraphMain"/>
+        <w:spacing w:line="360" w:lineRule="auto" w:before="0" w:after="0"/>
+        <w:ind w:firstLine="709"/>
         <w:jc w:val="both"/>
       </w:pPr>
       <w:r>
@@ -690,8 +731,10 @@
     </w:p>
     <w:p>
       <w:pPr>
-        <w:pStyle w:val="HeaderMain"/>
+        <w:pStyle w:val="Heading1"/>
         <w:pageBreakBefore/>
+        <w:spacing w:line="360" w:lineRule="auto" w:before="240" w:after="240"/>
+        <w:ind w:firstLine="0"/>
         <w:jc w:val="center"/>
       </w:pPr>
       <w:r>
@@ -706,7 +749,9 @@
     </w:p>
     <w:p>
       <w:pPr>
-        <w:pStyle w:val="Headerlower"/>
+        <w:pStyle w:val="Heading2"/>
+        <w:spacing w:line="360" w:lineRule="auto" w:before="120" w:after="0"/>
+        <w:ind w:firstLine="709"/>
         <w:jc w:val="both"/>
       </w:pPr>
       <w:r>
@@ -721,7 +766,8 @@
     </w:p>
     <w:p>
       <w:pPr>
-        <w:pStyle w:val="ParagraphMain"/>
+        <w:spacing w:line="360" w:lineRule="auto" w:before="0" w:after="0"/>
+        <w:ind w:firstLine="709"/>
         <w:jc w:val="both"/>
       </w:pPr>
       <w:r>
@@ -736,7 +782,9 @@
     </w:p>
     <w:p>
       <w:pPr>
-        <w:pStyle w:val="Headerlower"/>
+        <w:pStyle w:val="Heading2"/>
+        <w:spacing w:line="360" w:lineRule="auto" w:before="120" w:after="0"/>
+        <w:ind w:firstLine="709"/>
         <w:jc w:val="both"/>
       </w:pPr>
       <w:r>
@@ -751,7 +799,9 @@
     </w:p>
     <w:p>
       <w:pPr>
-        <w:pStyle w:val="ListMain"/>
+        <w:pStyle w:val="ListParagraph"/>
+        <w:spacing w:line="360" w:lineRule="auto" w:before="0" w:after="0"/>
+        <w:ind w:firstLine="709"/>
         <w:jc w:val="both"/>
       </w:pPr>
       <w:r>
@@ -761,12 +811,14 @@
           <w:color w:val="000000"/>
           <w:sz w:val="28"/>
         </w:rPr>
-        <w:t>• Расчет объема ОЗУ (DDR4/DDR5) с учетом буферного пула (Buffer Pool) SQL Server и тяжеловесной среды Visual Studio (рекомендуемый объем от 16-32 ГБ).</w:t>
+        <w:t>— Расчет объема ОЗУ (DDR4/DDR5) с учетом буферного пула (Buffer Pool) SQL Server и тяжеловесной среды Visual Studio (рекомендуемый объем от 16-32 ГБ).</w:t>
       </w:r>
     </w:p>
     <w:p>
       <w:pPr>
-        <w:pStyle w:val="ListMain"/>
+        <w:pStyle w:val="ListParagraph"/>
+        <w:spacing w:line="360" w:lineRule="auto" w:before="0" w:after="0"/>
+        <w:ind w:firstLine="709"/>
         <w:jc w:val="both"/>
       </w:pPr>
       <w:r>
@@ -776,12 +828,14 @@
           <w:color w:val="000000"/>
           <w:sz w:val="28"/>
         </w:rPr>
-        <w:t>• Выбор многоядерного процессора (Intel Core i5/i7 или AMD Ryzen 5/7) для параллельной обработки запросов и компиляции.</w:t>
+        <w:t>— Выбор многоядерного процессора (Intel Core i5/i7 или AMD Ryzen 5/7) для параллельной обработки запросов и компиляции.</w:t>
       </w:r>
     </w:p>
     <w:p>
       <w:pPr>
-        <w:pStyle w:val="ListMain"/>
+        <w:pStyle w:val="ListParagraph"/>
+        <w:spacing w:line="360" w:lineRule="auto" w:before="0" w:after="0"/>
+        <w:ind w:firstLine="709"/>
         <w:jc w:val="both"/>
       </w:pPr>
       <w:r>
@@ -791,12 +845,14 @@
           <w:color w:val="000000"/>
           <w:sz w:val="28"/>
         </w:rPr>
-        <w:t>• Обоснование установки скоростного твердотельного накопителя NVMe PCIe 4.0 для минимизации задержек I/O при транзакциях СУБД.</w:t>
+        <w:t>— Обоснование установки скоростного твердотельного накопителя NVMe PCIe 4.0 для минимизации задержек I/O при транзакциях СУБД.</w:t>
       </w:r>
     </w:p>
     <w:p>
       <w:pPr>
-        <w:pStyle w:val="ListMain"/>
+        <w:pStyle w:val="ListParagraph"/>
+        <w:spacing w:line="360" w:lineRule="auto" w:before="0" w:after="0"/>
+        <w:ind w:firstLine="709"/>
         <w:jc w:val="both"/>
       </w:pPr>
       <w:r>
@@ -806,12 +862,14 @@
           <w:color w:val="000000"/>
           <w:sz w:val="28"/>
         </w:rPr>
-        <w:t>• Сводная спецификация комплектующих ПК с калькуляцией бюджета внедрения.</w:t>
+        <w:t>— Сводная спецификация комплектующих ПК с калькуляцией бюджета внедрения.</w:t>
       </w:r>
     </w:p>
     <w:p>
       <w:pPr>
-        <w:pStyle w:val="Headerlower"/>
+        <w:pStyle w:val="Heading2"/>
+        <w:spacing w:line="360" w:lineRule="auto" w:before="120" w:after="0"/>
+        <w:ind w:firstLine="709"/>
         <w:jc w:val="both"/>
       </w:pPr>
       <w:r>
@@ -826,7 +884,8 @@
     </w:p>
     <w:p>
       <w:pPr>
-        <w:pStyle w:val="Picturemain"/>
+        <w:spacing w:line="360" w:lineRule="auto" w:before="120" w:after="120"/>
+        <w:ind w:firstLine="0"/>
         <w:jc w:val="center"/>
       </w:pPr>
       <w:r>
@@ -843,7 +902,9 @@
     </w:p>
     <w:p>
       <w:pPr>
-        <w:pStyle w:val="Headerlower"/>
+        <w:pStyle w:val="Heading2"/>
+        <w:spacing w:line="360" w:lineRule="auto" w:before="120" w:after="0"/>
+        <w:ind w:firstLine="709"/>
         <w:jc w:val="both"/>
       </w:pPr>
       <w:r>
@@ -858,7 +919,8 @@
     </w:p>
     <w:p>
       <w:pPr>
-        <w:pStyle w:val="ParagraphMain"/>
+        <w:spacing w:line="360" w:lineRule="auto" w:before="0" w:after="0"/>
+        <w:ind w:firstLine="709"/>
         <w:jc w:val="both"/>
       </w:pPr>
       <w:r>
@@ -873,8 +935,10 @@
     </w:p>
     <w:p>
       <w:pPr>
-        <w:pStyle w:val="HeaderMain"/>
+        <w:pStyle w:val="Heading1"/>
         <w:pageBreakBefore/>
+        <w:spacing w:line="360" w:lineRule="auto" w:before="240" w:after="240"/>
+        <w:ind w:firstLine="0"/>
         <w:jc w:val="center"/>
       </w:pPr>
       <w:r>
@@ -889,7 +953,9 @@
     </w:p>
     <w:p>
       <w:pPr>
-        <w:pStyle w:val="Headerlower"/>
+        <w:pStyle w:val="Heading2"/>
+        <w:spacing w:line="360" w:lineRule="auto" w:before="120" w:after="0"/>
+        <w:ind w:firstLine="709"/>
         <w:jc w:val="both"/>
       </w:pPr>
       <w:r>
@@ -904,7 +970,8 @@
     </w:p>
     <w:p>
       <w:pPr>
-        <w:pStyle w:val="ParagraphMain"/>
+        <w:spacing w:line="360" w:lineRule="auto" w:before="0" w:after="0"/>
+        <w:ind w:firstLine="709"/>
         <w:jc w:val="both"/>
       </w:pPr>
       <w:r>
@@ -919,7 +986,9 @@
     </w:p>
     <w:p>
       <w:pPr>
-        <w:pStyle w:val="Headerlower"/>
+        <w:pStyle w:val="Heading2"/>
+        <w:spacing w:line="360" w:lineRule="auto" w:before="120" w:after="0"/>
+        <w:ind w:firstLine="709"/>
         <w:jc w:val="both"/>
       </w:pPr>
       <w:r>
@@ -934,7 +1003,9 @@
     </w:p>
     <w:p>
       <w:pPr>
-        <w:pStyle w:val="ListMain"/>
+        <w:pStyle w:val="ListParagraph"/>
+        <w:spacing w:line="360" w:lineRule="auto" w:before="0" w:after="0"/>
+        <w:ind w:firstLine="709"/>
         <w:jc w:val="both"/>
       </w:pPr>
       <w:r>
@@ -944,12 +1015,14 @@
           <w:color w:val="000000"/>
           <w:sz w:val="28"/>
         </w:rPr>
-        <w:t>• Развертывание экземпляра SQLEXPRESS, включение смешанной аутентификации (SQL Server &amp; Windows Authentication), активация системного администратора sa.</w:t>
+        <w:t>— Развертывание экземпляра SQLEXPRESS, включение смешанной аутентификации (SQL Server &amp; Windows Authentication), активация системного администратора sa.</w:t>
       </w:r>
     </w:p>
     <w:p>
       <w:pPr>
-        <w:pStyle w:val="ListMain"/>
+        <w:pStyle w:val="ListParagraph"/>
+        <w:spacing w:line="360" w:lineRule="auto" w:before="0" w:after="0"/>
+        <w:ind w:firstLine="709"/>
         <w:jc w:val="both"/>
       </w:pPr>
       <w:r>
@@ -959,12 +1032,14 @@
           <w:color w:val="000000"/>
           <w:sz w:val="28"/>
         </w:rPr>
-        <w:t>• Конфигурирование протокола TCP/IP (порт 1433) в SQL Server Configuration Manager для сетевого взаимодействия с приложением.</w:t>
+        <w:t>— Конфигурирование протокола TCP/IP (порт 1433) в SQL Server Configuration Manager для сетевого взаимодействия с приложением.</w:t>
       </w:r>
     </w:p>
     <w:p>
       <w:pPr>
-        <w:pStyle w:val="ListMain"/>
+        <w:pStyle w:val="ListParagraph"/>
+        <w:spacing w:line="360" w:lineRule="auto" w:before="0" w:after="0"/>
+        <w:ind w:firstLine="709"/>
         <w:jc w:val="both"/>
       </w:pPr>
       <w:r>
@@ -974,12 +1049,14 @@
           <w:color w:val="000000"/>
           <w:sz w:val="28"/>
         </w:rPr>
-        <w:t>• Разработка полного DDL T-SQL скрипта создания 6 обязательных таблиц проекта с первичными ключами (PK) и связями (FK 1:N и N:M).</w:t>
+        <w:t>— Разработка полного DDL T-SQL скрипта создания 6 обязательных таблиц проекта с первичными ключами (PK) и связями (FK 1:N и N:M).</w:t>
       </w:r>
     </w:p>
     <w:p>
       <w:pPr>
-        <w:pStyle w:val="ListMain"/>
+        <w:pStyle w:val="ListParagraph"/>
+        <w:spacing w:line="360" w:lineRule="auto" w:before="0" w:after="0"/>
+        <w:ind w:firstLine="709"/>
         <w:jc w:val="both"/>
       </w:pPr>
       <w:r>
@@ -989,12 +1066,14 @@
           <w:color w:val="000000"/>
           <w:sz w:val="28"/>
         </w:rPr>
-        <w:t>• Построение визуальной физической диаграммы БД (Database Diagram) в среде SSMS.</w:t>
+        <w:t>— Построение визуальной физической диаграммы БД (Database Diagram) в среде SSMS.</w:t>
       </w:r>
     </w:p>
     <w:p>
       <w:pPr>
-        <w:pStyle w:val="Headerlower"/>
+        <w:pStyle w:val="Heading2"/>
+        <w:spacing w:line="360" w:lineRule="auto" w:before="120" w:after="0"/>
+        <w:ind w:firstLine="709"/>
         <w:jc w:val="both"/>
       </w:pPr>
       <w:r>
@@ -1009,7 +1088,8 @@
     </w:p>
     <w:p>
       <w:pPr>
-        <w:pStyle w:val="Picturemain"/>
+        <w:spacing w:line="360" w:lineRule="auto" w:before="120" w:after="120"/>
+        <w:ind w:firstLine="0"/>
         <w:jc w:val="center"/>
       </w:pPr>
       <w:r>
@@ -1026,7 +1106,9 @@
     </w:p>
     <w:p>
       <w:pPr>
-        <w:pStyle w:val="Headerlower"/>
+        <w:pStyle w:val="Heading2"/>
+        <w:spacing w:line="360" w:lineRule="auto" w:before="120" w:after="0"/>
+        <w:ind w:firstLine="709"/>
         <w:jc w:val="both"/>
       </w:pPr>
       <w:r>
@@ -1041,7 +1123,8 @@
     </w:p>
     <w:p>
       <w:pPr>
-        <w:pStyle w:val="ParagraphMain"/>
+        <w:spacing w:line="360" w:lineRule="auto" w:before="0" w:after="0"/>
+        <w:ind w:firstLine="709"/>
         <w:jc w:val="both"/>
       </w:pPr>
       <w:r>
@@ -1056,8 +1139,10 @@
     </w:p>
     <w:p>
       <w:pPr>
-        <w:pStyle w:val="HeaderMain"/>
+        <w:pStyle w:val="Heading1"/>
         <w:pageBreakBefore/>
+        <w:spacing w:line="360" w:lineRule="auto" w:before="240" w:after="240"/>
+        <w:ind w:firstLine="0"/>
         <w:jc w:val="center"/>
       </w:pPr>
       <w:r>
@@ -1072,7 +1157,9 @@
     </w:p>
     <w:p>
       <w:pPr>
-        <w:pStyle w:val="Headerlower"/>
+        <w:pStyle w:val="Heading2"/>
+        <w:spacing w:line="360" w:lineRule="auto" w:before="120" w:after="0"/>
+        <w:ind w:firstLine="709"/>
         <w:jc w:val="both"/>
       </w:pPr>
       <w:r>
@@ -1087,7 +1174,8 @@
     </w:p>
     <w:p>
       <w:pPr>
-        <w:pStyle w:val="ParagraphMain"/>
+        <w:spacing w:line="360" w:lineRule="auto" w:before="0" w:after="0"/>
+        <w:ind w:firstLine="709"/>
         <w:jc w:val="both"/>
       </w:pPr>
       <w:r>
@@ -1102,7 +1190,9 @@
     </w:p>
     <w:p>
       <w:pPr>
-        <w:pStyle w:val="Headerlower"/>
+        <w:pStyle w:val="Heading2"/>
+        <w:spacing w:line="360" w:lineRule="auto" w:before="120" w:after="0"/>
+        <w:ind w:firstLine="709"/>
         <w:jc w:val="both"/>
       </w:pPr>
       <w:r>
@@ -1117,7 +1207,9 @@
     </w:p>
     <w:p>
       <w:pPr>
-        <w:pStyle w:val="ListMain"/>
+        <w:pStyle w:val="ListParagraph"/>
+        <w:spacing w:line="360" w:lineRule="auto" w:before="0" w:after="0"/>
+        <w:ind w:firstLine="709"/>
         <w:jc w:val="both"/>
       </w:pPr>
       <w:r>
@@ -1127,12 +1219,14 @@
           <w:color w:val="000000"/>
           <w:sz w:val="28"/>
         </w:rPr>
-        <w:t>• Разделение файлов базы данных: первичный файл данных (.mdf) и журнал транзакций (.ldf) на выделенных разделах накопителя.</w:t>
+        <w:t>— Разделение файлов базы данных: первичный файл данных (.mdf) и журнал транзакций (.ldf) на выделенных разделах накопителя.</w:t>
       </w:r>
     </w:p>
     <w:p>
       <w:pPr>
-        <w:pStyle w:val="ListMain"/>
+        <w:pStyle w:val="ListParagraph"/>
+        <w:spacing w:line="360" w:lineRule="auto" w:before="0" w:after="0"/>
+        <w:ind w:firstLine="709"/>
         <w:jc w:val="both"/>
       </w:pPr>
       <w:r>
@@ -1142,12 +1236,14 @@
           <w:color w:val="000000"/>
           <w:sz w:val="28"/>
         </w:rPr>
-        <w:t>• Применение разметки GPT и файловой системы NTFS с размером кластера 64 КБ (рекомендация Microsoft для высоконагруженных БД).</w:t>
+        <w:t>— Применение разметки GPT и файловой системы NTFS с размером кластера 64 КБ (рекомендация Microsoft для высоконагруженных БД).</w:t>
       </w:r>
     </w:p>
     <w:p>
       <w:pPr>
-        <w:pStyle w:val="ListMain"/>
+        <w:pStyle w:val="ListParagraph"/>
+        <w:spacing w:line="360" w:lineRule="auto" w:before="0" w:after="0"/>
+        <w:ind w:firstLine="709"/>
         <w:jc w:val="both"/>
       </w:pPr>
       <w:r>
@@ -1157,12 +1253,14 @@
           <w:color w:val="000000"/>
           <w:sz w:val="28"/>
         </w:rPr>
-        <w:t>• Диагностика физического накопителя по таблице параметров S.M.A.R.T. (CrystalDiskInfo): контроль Reallocated Sectors и Pending Sectors.</w:t>
+        <w:t>— Диагностика физического накопителя по таблице параметров S.M.A.R.T. (CrystalDiskInfo): контроль Reallocated Sectors и Pending Sectors.</w:t>
       </w:r>
     </w:p>
     <w:p>
       <w:pPr>
-        <w:pStyle w:val="ListMain"/>
+        <w:pStyle w:val="ListParagraph"/>
+        <w:spacing w:line="360" w:lineRule="auto" w:before="0" w:after="0"/>
+        <w:ind w:firstLine="709"/>
         <w:jc w:val="both"/>
       </w:pPr>
       <w:r>
@@ -1172,12 +1270,14 @@
           <w:color w:val="000000"/>
           <w:sz w:val="28"/>
         </w:rPr>
-        <w:t>• Проверка логической целостности базы данных системной командой DBCC CHECKDB.</w:t>
+        <w:t>— Проверка логической целостности базы данных системной командой DBCC CHECKDB.</w:t>
       </w:r>
     </w:p>
     <w:p>
       <w:pPr>
-        <w:pStyle w:val="Headerlower"/>
+        <w:pStyle w:val="Heading2"/>
+        <w:spacing w:line="360" w:lineRule="auto" w:before="120" w:after="0"/>
+        <w:ind w:firstLine="709"/>
         <w:jc w:val="both"/>
       </w:pPr>
       <w:r>
@@ -1192,7 +1292,8 @@
     </w:p>
     <w:p>
       <w:pPr>
-        <w:pStyle w:val="Picturemain"/>
+        <w:spacing w:line="360" w:lineRule="auto" w:before="120" w:after="120"/>
+        <w:ind w:firstLine="0"/>
         <w:jc w:val="center"/>
       </w:pPr>
       <w:r>
@@ -1209,7 +1310,9 @@
     </w:p>
     <w:p>
       <w:pPr>
-        <w:pStyle w:val="Headerlower"/>
+        <w:pStyle w:val="Heading2"/>
+        <w:spacing w:line="360" w:lineRule="auto" w:before="120" w:after="0"/>
+        <w:ind w:firstLine="709"/>
         <w:jc w:val="both"/>
       </w:pPr>
       <w:r>
@@ -1224,7 +1327,8 @@
     </w:p>
     <w:p>
       <w:pPr>
-        <w:pStyle w:val="ParagraphMain"/>
+        <w:spacing w:line="360" w:lineRule="auto" w:before="0" w:after="0"/>
+        <w:ind w:firstLine="709"/>
         <w:jc w:val="both"/>
       </w:pPr>
       <w:r>
@@ -1239,8 +1343,10 @@
     </w:p>
     <w:p>
       <w:pPr>
-        <w:pStyle w:val="HeaderMain"/>
+        <w:pStyle w:val="Heading1"/>
         <w:pageBreakBefore/>
+        <w:spacing w:line="360" w:lineRule="auto" w:before="240" w:after="240"/>
+        <w:ind w:firstLine="0"/>
         <w:jc w:val="center"/>
       </w:pPr>
       <w:r>
@@ -1255,7 +1361,9 @@
     </w:p>
     <w:p>
       <w:pPr>
-        <w:pStyle w:val="Headerlower"/>
+        <w:pStyle w:val="Heading2"/>
+        <w:spacing w:line="360" w:lineRule="auto" w:before="120" w:after="0"/>
+        <w:ind w:firstLine="709"/>
         <w:jc w:val="both"/>
       </w:pPr>
       <w:r>
@@ -1270,7 +1378,8 @@
     </w:p>
     <w:p>
       <w:pPr>
-        <w:pStyle w:val="ParagraphMain"/>
+        <w:spacing w:line="360" w:lineRule="auto" w:before="0" w:after="0"/>
+        <w:ind w:firstLine="709"/>
         <w:jc w:val="both"/>
       </w:pPr>
       <w:r>
@@ -1285,7 +1394,9 @@
     </w:p>
     <w:p>
       <w:pPr>
-        <w:pStyle w:val="Headerlower"/>
+        <w:pStyle w:val="Heading2"/>
+        <w:spacing w:line="360" w:lineRule="auto" w:before="120" w:after="0"/>
+        <w:ind w:firstLine="709"/>
         <w:jc w:val="both"/>
       </w:pPr>
       <w:r>
@@ -1300,7 +1411,9 @@
     </w:p>
     <w:p>
       <w:pPr>
-        <w:pStyle w:val="ListMain"/>
+        <w:pStyle w:val="ListParagraph"/>
+        <w:spacing w:line="360" w:lineRule="auto" w:before="0" w:after="0"/>
+        <w:ind w:firstLine="709"/>
         <w:jc w:val="both"/>
       </w:pPr>
       <w:r>
@@ -1310,12 +1423,14 @@
           <w:color w:val="000000"/>
           <w:sz w:val="28"/>
         </w:rPr>
-        <w:t>• Настройка доверенных зон и правил исключений антивируса для каталогов Visual Studio: bin\Debug, bin\Release, obj и кэша NuGet.</w:t>
+        <w:t>— Настройка доверенных зон и правил исключений антивируса для каталогов Visual Studio: bin\Debug, bin\Release, obj и кэша NuGet.</w:t>
       </w:r>
     </w:p>
     <w:p>
       <w:pPr>
-        <w:pStyle w:val="ListMain"/>
+        <w:pStyle w:val="ListParagraph"/>
+        <w:spacing w:line="360" w:lineRule="auto" w:before="0" w:after="0"/>
+        <w:ind w:firstLine="709"/>
         <w:jc w:val="both"/>
       </w:pPr>
       <w:r>
@@ -1325,12 +1440,14 @@
           <w:color w:val="000000"/>
           <w:sz w:val="28"/>
         </w:rPr>
-        <w:t>• Исключение из постоянного сканирования рабочих файлов базы данных (.mdf, .ldf), предотвращающее взаимные блокировки при записи транзакций.</w:t>
+        <w:t>— Исключение из постоянного сканирования рабочих файлов базы данных (.mdf, .ldf), предотвращающее взаимные блокировки при записи транзакций.</w:t>
       </w:r>
     </w:p>
     <w:p>
       <w:pPr>
-        <w:pStyle w:val="ListMain"/>
+        <w:pStyle w:val="ListParagraph"/>
+        <w:spacing w:line="360" w:lineRule="auto" w:before="0" w:after="0"/>
+        <w:ind w:firstLine="709"/>
         <w:jc w:val="both"/>
       </w:pPr>
       <w:r>
@@ -1340,12 +1457,14 @@
           <w:color w:val="000000"/>
           <w:sz w:val="28"/>
         </w:rPr>
-        <w:t>• Проверка используемых внешних библиотек (MaterialSkin.2) на отсутствие вредоносного кода и сигнатурных угроз.</w:t>
+        <w:t>— Проверка используемых внешних библиотек (MaterialSkin.2) на отсутствие вредоносного кода и сигнатурных угроз.</w:t>
       </w:r>
     </w:p>
     <w:p>
       <w:pPr>
-        <w:pStyle w:val="ListMain"/>
+        <w:pStyle w:val="ListParagraph"/>
+        <w:spacing w:line="360" w:lineRule="auto" w:before="0" w:after="0"/>
+        <w:ind w:firstLine="709"/>
         <w:jc w:val="both"/>
       </w:pPr>
       <w:r>
@@ -1355,12 +1474,14 @@
           <w:color w:val="000000"/>
           <w:sz w:val="28"/>
         </w:rPr>
-        <w:t>• Оценка быстродействия сборки решения до и после внесения каталогов в список исключений.</w:t>
+        <w:t>— Оценка быстродействия сборки решения до и после внесения каталогов в список исключений.</w:t>
       </w:r>
     </w:p>
     <w:p>
       <w:pPr>
-        <w:pStyle w:val="Headerlower"/>
+        <w:pStyle w:val="Heading2"/>
+        <w:spacing w:line="360" w:lineRule="auto" w:before="120" w:after="0"/>
+        <w:ind w:firstLine="709"/>
         <w:jc w:val="both"/>
       </w:pPr>
       <w:r>
@@ -1375,7 +1496,8 @@
     </w:p>
     <w:p>
       <w:pPr>
-        <w:pStyle w:val="Picturemain"/>
+        <w:spacing w:line="360" w:lineRule="auto" w:before="120" w:after="120"/>
+        <w:ind w:firstLine="0"/>
         <w:jc w:val="center"/>
       </w:pPr>
       <w:r>
@@ -1392,7 +1514,9 @@
     </w:p>
     <w:p>
       <w:pPr>
-        <w:pStyle w:val="Headerlower"/>
+        <w:pStyle w:val="Heading2"/>
+        <w:spacing w:line="360" w:lineRule="auto" w:before="120" w:after="0"/>
+        <w:ind w:firstLine="709"/>
         <w:jc w:val="both"/>
       </w:pPr>
       <w:r>
@@ -1407,7 +1531,8 @@
     </w:p>
     <w:p>
       <w:pPr>
-        <w:pStyle w:val="ParagraphMain"/>
+        <w:spacing w:line="360" w:lineRule="auto" w:before="0" w:after="0"/>
+        <w:ind w:firstLine="709"/>
         <w:jc w:val="both"/>
       </w:pPr>
       <w:r>
@@ -1422,8 +1547,10 @@
     </w:p>
     <w:p>
       <w:pPr>
-        <w:pStyle w:val="HeaderMain"/>
+        <w:pStyle w:val="Heading1"/>
         <w:pageBreakBefore/>
+        <w:spacing w:line="360" w:lineRule="auto" w:before="240" w:after="240"/>
+        <w:ind w:firstLine="0"/>
         <w:jc w:val="center"/>
       </w:pPr>
       <w:r>
@@ -1438,7 +1565,9 @@
     </w:p>
     <w:p>
       <w:pPr>
-        <w:pStyle w:val="Headerlower"/>
+        <w:pStyle w:val="Heading2"/>
+        <w:spacing w:line="360" w:lineRule="auto" w:before="120" w:after="0"/>
+        <w:ind w:firstLine="709"/>
         <w:jc w:val="both"/>
       </w:pPr>
       <w:r>
@@ -1453,7 +1582,8 @@
     </w:p>
     <w:p>
       <w:pPr>
-        <w:pStyle w:val="ParagraphMain"/>
+        <w:spacing w:line="360" w:lineRule="auto" w:before="0" w:after="0"/>
+        <w:ind w:firstLine="709"/>
         <w:jc w:val="both"/>
       </w:pPr>
       <w:r>
@@ -1468,7 +1598,9 @@
     </w:p>
     <w:p>
       <w:pPr>
-        <w:pStyle w:val="Headerlower"/>
+        <w:pStyle w:val="Heading2"/>
+        <w:spacing w:line="360" w:lineRule="auto" w:before="120" w:after="0"/>
+        <w:ind w:firstLine="709"/>
         <w:jc w:val="both"/>
       </w:pPr>
       <w:r>
@@ -1483,7 +1615,9 @@
     </w:p>
     <w:p>
       <w:pPr>
-        <w:pStyle w:val="ListMain"/>
+        <w:pStyle w:val="ListParagraph"/>
+        <w:spacing w:line="360" w:lineRule="auto" w:before="0" w:after="0"/>
+        <w:ind w:firstLine="709"/>
         <w:jc w:val="both"/>
       </w:pPr>
       <w:r>
@@ -1493,12 +1627,14 @@
           <w:color w:val="000000"/>
           <w:sz w:val="28"/>
         </w:rPr>
-        <w:t>• Стресс-тестирование центрального процессора и оперативной памяти с помощью диагностических пакетов (AIDA64 / OCCT).</w:t>
+        <w:t>— Стресс-тестирование центрального процессора и оперативной памяти с помощью диагностических пакетов (AIDA64 / OCCT).</w:t>
       </w:r>
     </w:p>
     <w:p>
       <w:pPr>
-        <w:pStyle w:val="ListMain"/>
+        <w:pStyle w:val="ListParagraph"/>
+        <w:spacing w:line="360" w:lineRule="auto" w:before="0" w:after="0"/>
+        <w:ind w:firstLine="709"/>
         <w:jc w:val="both"/>
       </w:pPr>
       <w:r>
@@ -1508,12 +1644,14 @@
           <w:color w:val="000000"/>
           <w:sz w:val="28"/>
         </w:rPr>
-        <w:t>• Генерация стрессовой нагрузки на базу данных ИС: скрипт массовой циклической вставки тестовых записей (10 000+ строк).</w:t>
+        <w:t>— Генерация стрессовой нагрузки на базу данных ИС: скрипт массовой циклической вставки тестовых записей (10 000+ строк).</w:t>
       </w:r>
     </w:p>
     <w:p>
       <w:pPr>
-        <w:pStyle w:val="ListMain"/>
+        <w:pStyle w:val="ListParagraph"/>
+        <w:spacing w:line="360" w:lineRule="auto" w:before="0" w:after="0"/>
+        <w:ind w:firstLine="709"/>
         <w:jc w:val="both"/>
       </w:pPr>
       <w:r>
@@ -1523,12 +1661,14 @@
           <w:color w:val="000000"/>
           <w:sz w:val="28"/>
         </w:rPr>
-        <w:t>• Мониторинг температурных показателей ЦП и видеочипа, контроль отсутствия теплового троттлинга (CPU Throttling 0%).</w:t>
+        <w:t>— Мониторинг температурных показателей ЦП и видеочипа, контроль отсутствия теплового троттлинга (CPU Throttling 0%).</w:t>
       </w:r>
     </w:p>
     <w:p>
       <w:pPr>
-        <w:pStyle w:val="ListMain"/>
+        <w:pStyle w:val="ListParagraph"/>
+        <w:spacing w:line="360" w:lineRule="auto" w:before="0" w:after="0"/>
+        <w:ind w:firstLine="709"/>
         <w:jc w:val="both"/>
       </w:pPr>
       <w:r>
@@ -1538,12 +1678,14 @@
           <w:color w:val="000000"/>
           <w:sz w:val="28"/>
         </w:rPr>
-        <w:t>• Оценка стабильности работы приложения и фонового экземпляра SQLEXPRESS при пиковой нагрузке.</w:t>
+        <w:t>— Оценка стабильности работы приложения и фонового экземпляра SQLEXPRESS при пиковой нагрузке.</w:t>
       </w:r>
     </w:p>
     <w:p>
       <w:pPr>
-        <w:pStyle w:val="Headerlower"/>
+        <w:pStyle w:val="Heading2"/>
+        <w:spacing w:line="360" w:lineRule="auto" w:before="120" w:after="0"/>
+        <w:ind w:firstLine="709"/>
         <w:jc w:val="both"/>
       </w:pPr>
       <w:r>
@@ -1558,7 +1700,8 @@
     </w:p>
     <w:p>
       <w:pPr>
-        <w:pStyle w:val="Picturemain"/>
+        <w:spacing w:line="360" w:lineRule="auto" w:before="120" w:after="120"/>
+        <w:ind w:firstLine="0"/>
         <w:jc w:val="center"/>
       </w:pPr>
       <w:r>
@@ -1575,7 +1718,9 @@
     </w:p>
     <w:p>
       <w:pPr>
-        <w:pStyle w:val="Headerlower"/>
+        <w:pStyle w:val="Heading2"/>
+        <w:spacing w:line="360" w:lineRule="auto" w:before="120" w:after="0"/>
+        <w:ind w:firstLine="709"/>
         <w:jc w:val="both"/>
       </w:pPr>
       <w:r>
@@ -1590,7 +1735,8 @@
     </w:p>
     <w:p>
       <w:pPr>
-        <w:pStyle w:val="ParagraphMain"/>
+        <w:spacing w:line="360" w:lineRule="auto" w:before="0" w:after="0"/>
+        <w:ind w:firstLine="709"/>
         <w:jc w:val="both"/>
       </w:pPr>
       <w:r>
@@ -1605,8 +1751,10 @@
     </w:p>
     <w:p>
       <w:pPr>
-        <w:pStyle w:val="HeaderMain"/>
+        <w:pStyle w:val="Heading1"/>
         <w:pageBreakBefore/>
+        <w:spacing w:line="360" w:lineRule="auto" w:before="240" w:after="240"/>
+        <w:ind w:firstLine="0"/>
         <w:jc w:val="center"/>
       </w:pPr>
       <w:r>
@@ -1621,7 +1769,9 @@
     </w:p>
     <w:p>
       <w:pPr>
-        <w:pStyle w:val="Headerlower"/>
+        <w:pStyle w:val="Heading2"/>
+        <w:spacing w:line="360" w:lineRule="auto" w:before="120" w:after="0"/>
+        <w:ind w:firstLine="709"/>
         <w:jc w:val="both"/>
       </w:pPr>
       <w:r>
@@ -1636,7 +1786,8 @@
     </w:p>
     <w:p>
       <w:pPr>
-        <w:pStyle w:val="ParagraphMain"/>
+        <w:spacing w:line="360" w:lineRule="auto" w:before="0" w:after="0"/>
+        <w:ind w:firstLine="709"/>
         <w:jc w:val="both"/>
       </w:pPr>
       <w:r>
@@ -1651,7 +1802,9 @@
     </w:p>
     <w:p>
       <w:pPr>
-        <w:pStyle w:val="Headerlower"/>
+        <w:pStyle w:val="Heading2"/>
+        <w:spacing w:line="360" w:lineRule="auto" w:before="120" w:after="0"/>
+        <w:ind w:firstLine="709"/>
         <w:jc w:val="both"/>
       </w:pPr>
       <w:r>
@@ -1666,7 +1819,9 @@
     </w:p>
     <w:p>
       <w:pPr>
-        <w:pStyle w:val="ListMain"/>
+        <w:pStyle w:val="ListParagraph"/>
+        <w:spacing w:line="360" w:lineRule="auto" w:before="0" w:after="0"/>
+        <w:ind w:firstLine="709"/>
         <w:jc w:val="both"/>
       </w:pPr>
       <w:r>
@@ -1676,12 +1831,14 @@
           <w:color w:val="000000"/>
           <w:sz w:val="28"/>
         </w:rPr>
-        <w:t>• Активация аудита успешных и неудачных попыток входа (Login Auditing) в свойствах экземпляра MS SQL Server.</w:t>
+        <w:t>— Активация аудита успешных и неудачных попыток входа (Login Auditing) в свойствах экземпляра MS SQL Server.</w:t>
       </w:r>
     </w:p>
     <w:p>
       <w:pPr>
-        <w:pStyle w:val="ListMain"/>
+        <w:pStyle w:val="ListParagraph"/>
+        <w:spacing w:line="360" w:lineRule="auto" w:before="0" w:after="0"/>
+        <w:ind w:firstLine="709"/>
         <w:jc w:val="both"/>
       </w:pPr>
       <w:r>
@@ -1691,12 +1848,14 @@
           <w:color w:val="000000"/>
           <w:sz w:val="28"/>
         </w:rPr>
-        <w:t>• Анализ системных журналов Windows (Event Viewer): журналы «Приложение» и «Безопасность» (события Event ID 18456).</w:t>
+        <w:t>— Анализ системных журналов Windows (Event Viewer): журналы «Приложение» и «Безопасность» (события Event ID 18456).</w:t>
       </w:r>
     </w:p>
     <w:p>
       <w:pPr>
-        <w:pStyle w:val="ListMain"/>
+        <w:pStyle w:val="ListParagraph"/>
+        <w:spacing w:line="360" w:lineRule="auto" w:before="0" w:after="0"/>
+        <w:ind w:firstLine="709"/>
         <w:jc w:val="both"/>
       </w:pPr>
       <w:r>
@@ -1706,12 +1865,14 @@
           <w:color w:val="000000"/>
           <w:sz w:val="28"/>
         </w:rPr>
-        <w:t>• Моделирование попытки несанкционированного доступа с неверным паролем и регистрация инцидента безопасности.</w:t>
+        <w:t>— Моделирование попытки несанкционированного доступа с неверным паролем и регистрация инцидента безопасности.</w:t>
       </w:r>
     </w:p>
     <w:p>
       <w:pPr>
-        <w:pStyle w:val="ListMain"/>
+        <w:pStyle w:val="ListParagraph"/>
+        <w:spacing w:line="360" w:lineRule="auto" w:before="0" w:after="0"/>
+        <w:ind w:firstLine="709"/>
         <w:jc w:val="both"/>
       </w:pPr>
       <w:r>
@@ -1721,12 +1882,14 @@
           <w:color w:val="000000"/>
           <w:sz w:val="28"/>
         </w:rPr>
-        <w:t>• Выгрузка журнала регистрации событий в текстовый протокол.</w:t>
+        <w:t>— Выгрузка журнала регистрации событий в текстовый протокол.</w:t>
       </w:r>
     </w:p>
     <w:p>
       <w:pPr>
-        <w:pStyle w:val="Headerlower"/>
+        <w:pStyle w:val="Heading2"/>
+        <w:spacing w:line="360" w:lineRule="auto" w:before="120" w:after="0"/>
+        <w:ind w:firstLine="709"/>
         <w:jc w:val="both"/>
       </w:pPr>
       <w:r>
@@ -1741,7 +1904,8 @@
     </w:p>
     <w:p>
       <w:pPr>
-        <w:pStyle w:val="Picturemain"/>
+        <w:spacing w:line="360" w:lineRule="auto" w:before="120" w:after="120"/>
+        <w:ind w:firstLine="0"/>
         <w:jc w:val="center"/>
       </w:pPr>
       <w:r>
@@ -1758,7 +1922,9 @@
     </w:p>
     <w:p>
       <w:pPr>
-        <w:pStyle w:val="Headerlower"/>
+        <w:pStyle w:val="Heading2"/>
+        <w:spacing w:line="360" w:lineRule="auto" w:before="120" w:after="0"/>
+        <w:ind w:firstLine="709"/>
         <w:jc w:val="both"/>
       </w:pPr>
       <w:r>
@@ -1773,7 +1939,8 @@
     </w:p>
     <w:p>
       <w:pPr>
-        <w:pStyle w:val="ParagraphMain"/>
+        <w:spacing w:line="360" w:lineRule="auto" w:before="0" w:after="0"/>
+        <w:ind w:firstLine="709"/>
         <w:jc w:val="both"/>
       </w:pPr>
       <w:r>
@@ -1788,8 +1955,10 @@
     </w:p>
     <w:p>
       <w:pPr>
-        <w:pStyle w:val="HeaderMain"/>
+        <w:pStyle w:val="Heading1"/>
         <w:pageBreakBefore/>
+        <w:spacing w:line="360" w:lineRule="auto" w:before="240" w:after="240"/>
+        <w:ind w:firstLine="0"/>
         <w:jc w:val="center"/>
       </w:pPr>
       <w:r>
@@ -1804,7 +1973,9 @@
     </w:p>
     <w:p>
       <w:pPr>
-        <w:pStyle w:val="Headerlower"/>
+        <w:pStyle w:val="Heading2"/>
+        <w:spacing w:line="360" w:lineRule="auto" w:before="120" w:after="0"/>
+        <w:ind w:firstLine="709"/>
         <w:jc w:val="both"/>
       </w:pPr>
       <w:r>
@@ -1819,7 +1990,8 @@
     </w:p>
     <w:p>
       <w:pPr>
-        <w:pStyle w:val="ParagraphMain"/>
+        <w:spacing w:line="360" w:lineRule="auto" w:before="0" w:after="0"/>
+        <w:ind w:firstLine="709"/>
         <w:jc w:val="both"/>
       </w:pPr>
       <w:r>
@@ -1834,7 +2006,9 @@
     </w:p>
     <w:p>
       <w:pPr>
-        <w:pStyle w:val="Headerlower"/>
+        <w:pStyle w:val="Heading2"/>
+        <w:spacing w:line="360" w:lineRule="auto" w:before="120" w:after="0"/>
+        <w:ind w:firstLine="709"/>
         <w:jc w:val="both"/>
       </w:pPr>
       <w:r>
@@ -1849,7 +2023,9 @@
     </w:p>
     <w:p>
       <w:pPr>
-        <w:pStyle w:val="ListMain"/>
+        <w:pStyle w:val="ListParagraph"/>
+        <w:spacing w:line="360" w:lineRule="auto" w:before="0" w:after="0"/>
+        <w:ind w:firstLine="709"/>
         <w:jc w:val="both"/>
       </w:pPr>
       <w:r>
@@ -1859,12 +2035,14 @@
           <w:color w:val="000000"/>
           <w:sz w:val="28"/>
         </w:rPr>
-        <w:t>• Создание служебной таблицы аудита SystemLogs в базе данных ИС (поля: LogId, UserName, ActionType, TableName, Timestamp, Details).</w:t>
+        <w:t>— Создание служебной таблицы аудита SystemLogs в базе данных ИС (поля: LogId, UserName, ActionType, TableName, Timestamp, Details).</w:t>
       </w:r>
     </w:p>
     <w:p>
       <w:pPr>
-        <w:pStyle w:val="ListMain"/>
+        <w:pStyle w:val="ListParagraph"/>
+        <w:spacing w:line="360" w:lineRule="auto" w:before="0" w:after="0"/>
+        <w:ind w:firstLine="709"/>
         <w:jc w:val="both"/>
       </w:pPr>
       <w:r>
@@ -1874,12 +2052,14 @@
           <w:color w:val="000000"/>
           <w:sz w:val="28"/>
         </w:rPr>
-        <w:t>• Разработка C# модуля автоматической записи событий добавления, изменения и удаления сущностей в журнал аудита.</w:t>
+        <w:t>— Разработка C# модуля автоматической записи событий добавления, изменения и удаления сущностей в журнал аудита.</w:t>
       </w:r>
     </w:p>
     <w:p>
       <w:pPr>
-        <w:pStyle w:val="ListMain"/>
+        <w:pStyle w:val="ListParagraph"/>
+        <w:spacing w:line="360" w:lineRule="auto" w:before="0" w:after="0"/>
+        <w:ind w:firstLine="709"/>
         <w:jc w:val="both"/>
       </w:pPr>
       <w:r>
@@ -1889,12 +2069,14 @@
           <w:color w:val="000000"/>
           <w:sz w:val="28"/>
         </w:rPr>
-        <w:t>• Настройка дисковых квот NTFS на папку экспортируемых отчетов и резервных копий для предотвращения переполнения диска.</w:t>
+        <w:t>— Настройка дисковых квот NTFS на папку экспортируемых отчетов и резервных копий для предотвращения переполнения диска.</w:t>
       </w:r>
     </w:p>
     <w:p>
       <w:pPr>
-        <w:pStyle w:val="ListMain"/>
+        <w:pStyle w:val="ListParagraph"/>
+        <w:spacing w:line="360" w:lineRule="auto" w:before="0" w:after="0"/>
+        <w:ind w:firstLine="709"/>
         <w:jc w:val="both"/>
       </w:pPr>
       <w:r>
@@ -1904,12 +2086,14 @@
           <w:color w:val="000000"/>
           <w:sz w:val="28"/>
         </w:rPr>
-        <w:t>• Тестирование срабатывания оповещения о превышении дискового лимита.</w:t>
+        <w:t>— Тестирование срабатывания оповещения о превышении дискового лимита.</w:t>
       </w:r>
     </w:p>
     <w:p>
       <w:pPr>
-        <w:pStyle w:val="Headerlower"/>
+        <w:pStyle w:val="Heading2"/>
+        <w:spacing w:line="360" w:lineRule="auto" w:before="120" w:after="0"/>
+        <w:ind w:firstLine="709"/>
         <w:jc w:val="both"/>
       </w:pPr>
       <w:r>
@@ -1924,7 +2108,8 @@
     </w:p>
     <w:p>
       <w:pPr>
-        <w:pStyle w:val="Picturemain"/>
+        <w:spacing w:line="360" w:lineRule="auto" w:before="120" w:after="120"/>
+        <w:ind w:firstLine="0"/>
         <w:jc w:val="center"/>
       </w:pPr>
       <w:r>
@@ -1941,7 +2126,9 @@
     </w:p>
     <w:p>
       <w:pPr>
-        <w:pStyle w:val="Headerlower"/>
+        <w:pStyle w:val="Heading2"/>
+        <w:spacing w:line="360" w:lineRule="auto" w:before="120" w:after="0"/>
+        <w:ind w:firstLine="709"/>
         <w:jc w:val="both"/>
       </w:pPr>
       <w:r>
@@ -1956,7 +2143,8 @@
     </w:p>
     <w:p>
       <w:pPr>
-        <w:pStyle w:val="ParagraphMain"/>
+        <w:spacing w:line="360" w:lineRule="auto" w:before="0" w:after="0"/>
+        <w:ind w:firstLine="709"/>
         <w:jc w:val="both"/>
       </w:pPr>
       <w:r>
@@ -1971,8 +2159,10 @@
     </w:p>
     <w:p>
       <w:pPr>
-        <w:pStyle w:val="HeaderMain"/>
+        <w:pStyle w:val="Heading1"/>
         <w:pageBreakBefore/>
+        <w:spacing w:line="360" w:lineRule="auto" w:before="240" w:after="240"/>
+        <w:ind w:firstLine="0"/>
         <w:jc w:val="center"/>
       </w:pPr>
       <w:r>
@@ -1987,7 +2177,9 @@
     </w:p>
     <w:p>
       <w:pPr>
-        <w:pStyle w:val="Headerlower"/>
+        <w:pStyle w:val="Heading2"/>
+        <w:spacing w:line="360" w:lineRule="auto" w:before="120" w:after="0"/>
+        <w:ind w:firstLine="709"/>
         <w:jc w:val="both"/>
       </w:pPr>
       <w:r>
@@ -2002,7 +2194,8 @@
     </w:p>
     <w:p>
       <w:pPr>
-        <w:pStyle w:val="ParagraphMain"/>
+        <w:spacing w:line="360" w:lineRule="auto" w:before="0" w:after="0"/>
+        <w:ind w:firstLine="709"/>
         <w:jc w:val="both"/>
       </w:pPr>
       <w:r>
@@ -2017,7 +2210,9 @@
     </w:p>
     <w:p>
       <w:pPr>
-        <w:pStyle w:val="Headerlower"/>
+        <w:pStyle w:val="Heading2"/>
+        <w:spacing w:line="360" w:lineRule="auto" w:before="120" w:after="0"/>
+        <w:ind w:firstLine="709"/>
         <w:jc w:val="both"/>
       </w:pPr>
       <w:r>
@@ -2032,7 +2227,9 @@
     </w:p>
     <w:p>
       <w:pPr>
-        <w:pStyle w:val="ListMain"/>
+        <w:pStyle w:val="ListParagraph"/>
+        <w:spacing w:line="360" w:lineRule="auto" w:before="0" w:after="0"/>
+        <w:ind w:firstLine="709"/>
         <w:jc w:val="both"/>
       </w:pPr>
       <w:r>
@@ -2042,12 +2239,14 @@
           <w:color w:val="000000"/>
           <w:sz w:val="28"/>
         </w:rPr>
-        <w:t>• Программный замер времени выполнения запросов к БД через TableAdapter.Fill() с использованием System.Diagnostics.Stopwatch.</w:t>
+        <w:t>— Программный замер времени выполнения запросов к БД через TableAdapter.Fill() с использованием System.Diagnostics.Stopwatch.</w:t>
       </w:r>
     </w:p>
     <w:p>
       <w:pPr>
-        <w:pStyle w:val="ListMain"/>
+        <w:pStyle w:val="ListParagraph"/>
+        <w:spacing w:line="360" w:lineRule="auto" w:before="0" w:after="0"/>
+        <w:ind w:firstLine="709"/>
         <w:jc w:val="both"/>
       </w:pPr>
       <w:r>
@@ -2057,12 +2256,14 @@
           <w:color w:val="000000"/>
           <w:sz w:val="28"/>
         </w:rPr>
-        <w:t>• Сравнительный бенчмарк выборки при объемах 100, 1000 и 5000 записей: Typed DataSet против прямого чтения через SqlDataReader.</w:t>
+        <w:t>— Сравнительный бенчмарк выборки при объемах 100, 1000 и 5000 записей: Typed DataSet против прямого чтения через SqlDataReader.</w:t>
       </w:r>
     </w:p>
     <w:p>
       <w:pPr>
-        <w:pStyle w:val="ListMain"/>
+        <w:pStyle w:val="ListParagraph"/>
+        <w:spacing w:line="360" w:lineRule="auto" w:before="0" w:after="0"/>
+        <w:ind w:firstLine="709"/>
         <w:jc w:val="both"/>
       </w:pPr>
       <w:r>
@@ -2072,12 +2273,14 @@
           <w:color w:val="000000"/>
           <w:sz w:val="28"/>
         </w:rPr>
-        <w:t>• Создание некластеризованных индексов (Non-Clustered Indexes) на внешних ключах (FK) для оптимизации операций JOIN.</w:t>
+        <w:t>— Создание некластеризованных индексов (Non-Clustered Indexes) на внешних ключах (FK) для оптимизации операций JOIN.</w:t>
       </w:r>
     </w:p>
     <w:p>
       <w:pPr>
-        <w:pStyle w:val="ListMain"/>
+        <w:pStyle w:val="ListParagraph"/>
+        <w:spacing w:line="360" w:lineRule="auto" w:before="0" w:after="0"/>
+        <w:ind w:firstLine="709"/>
         <w:jc w:val="both"/>
       </w:pPr>
       <w:r>
@@ -2087,12 +2290,14 @@
           <w:color w:val="000000"/>
           <w:sz w:val="28"/>
         </w:rPr>
-        <w:t>• Построение графика зависимости времени выборки от объема данных и наличия индексов.</w:t>
+        <w:t>— Построение графика зависимости времени выборки от объема данных и наличия индексов.</w:t>
       </w:r>
     </w:p>
     <w:p>
       <w:pPr>
-        <w:pStyle w:val="Headerlower"/>
+        <w:pStyle w:val="Heading2"/>
+        <w:spacing w:line="360" w:lineRule="auto" w:before="120" w:after="0"/>
+        <w:ind w:firstLine="709"/>
         <w:jc w:val="both"/>
       </w:pPr>
       <w:r>
@@ -2107,7 +2312,8 @@
     </w:p>
     <w:p>
       <w:pPr>
-        <w:pStyle w:val="Picturemain"/>
+        <w:spacing w:line="360" w:lineRule="auto" w:before="120" w:after="120"/>
+        <w:ind w:firstLine="0"/>
         <w:jc w:val="center"/>
       </w:pPr>
       <w:r>
@@ -2124,7 +2330,9 @@
     </w:p>
     <w:p>
       <w:pPr>
-        <w:pStyle w:val="Headerlower"/>
+        <w:pStyle w:val="Heading2"/>
+        <w:spacing w:line="360" w:lineRule="auto" w:before="120" w:after="0"/>
+        <w:ind w:firstLine="709"/>
         <w:jc w:val="both"/>
       </w:pPr>
       <w:r>
@@ -2139,7 +2347,8 @@
     </w:p>
     <w:p>
       <w:pPr>
-        <w:pStyle w:val="ParagraphMain"/>
+        <w:spacing w:line="360" w:lineRule="auto" w:before="0" w:after="0"/>
+        <w:ind w:firstLine="709"/>
         <w:jc w:val="both"/>
       </w:pPr>
       <w:r>
@@ -2154,8 +2363,10 @@
     </w:p>
     <w:p>
       <w:pPr>
-        <w:pStyle w:val="HeaderMain"/>
+        <w:pStyle w:val="Heading1"/>
         <w:pageBreakBefore/>
+        <w:spacing w:line="360" w:lineRule="auto" w:before="240" w:after="240"/>
+        <w:ind w:firstLine="0"/>
         <w:jc w:val="center"/>
       </w:pPr>
       <w:r>
@@ -2170,7 +2381,9 @@
     </w:p>
     <w:p>
       <w:pPr>
-        <w:pStyle w:val="Headerlower"/>
+        <w:pStyle w:val="Heading2"/>
+        <w:spacing w:line="360" w:lineRule="auto" w:before="120" w:after="0"/>
+        <w:ind w:firstLine="709"/>
         <w:jc w:val="both"/>
       </w:pPr>
       <w:r>
@@ -2185,7 +2398,8 @@
     </w:p>
     <w:p>
       <w:pPr>
-        <w:pStyle w:val="ParagraphMain"/>
+        <w:spacing w:line="360" w:lineRule="auto" w:before="0" w:after="0"/>
+        <w:ind w:firstLine="709"/>
         <w:jc w:val="both"/>
       </w:pPr>
       <w:r>
@@ -2200,7 +2414,9 @@
     </w:p>
     <w:p>
       <w:pPr>
-        <w:pStyle w:val="Headerlower"/>
+        <w:pStyle w:val="Heading2"/>
+        <w:spacing w:line="360" w:lineRule="auto" w:before="120" w:after="0"/>
+        <w:ind w:firstLine="709"/>
         <w:jc w:val="both"/>
       </w:pPr>
       <w:r>
@@ -2215,7 +2431,9 @@
     </w:p>
     <w:p>
       <w:pPr>
-        <w:pStyle w:val="ListMain"/>
+        <w:pStyle w:val="ListParagraph"/>
+        <w:spacing w:line="360" w:lineRule="auto" w:before="0" w:after="0"/>
+        <w:ind w:firstLine="709"/>
         <w:jc w:val="both"/>
       </w:pPr>
       <w:r>
@@ -2225,12 +2443,14 @@
           <w:color w:val="000000"/>
           <w:sz w:val="28"/>
         </w:rPr>
-        <w:t>• Изучение архитектуры блочного симметричного шифрования AES (Advanced Encryption Standard, Rijndael, длина ключа 256 бит).</w:t>
+        <w:t>— Изучение архитектуры блочного симметричного шифрования AES (Advanced Encryption Standard, Rijndael, длина ключа 256 бит).</w:t>
       </w:r>
     </w:p>
     <w:p>
       <w:pPr>
-        <w:pStyle w:val="ListMain"/>
+        <w:pStyle w:val="ListParagraph"/>
+        <w:spacing w:line="360" w:lineRule="auto" w:before="0" w:after="0"/>
+        <w:ind w:firstLine="709"/>
         <w:jc w:val="both"/>
       </w:pPr>
       <w:r>
@@ -2240,12 +2460,14 @@
           <w:color w:val="000000"/>
           <w:sz w:val="28"/>
         </w:rPr>
-        <w:t>• Реализация служебного класса CryptoManager с методами EncryptFile() и DecryptFile() на базе пространства имен System.Security.Cryptography.</w:t>
+        <w:t>— Реализация служебного класса CryptoManager с методами EncryptFile() и DecryptFile() на базе пространства имен System.Security.Cryptography.</w:t>
       </w:r>
     </w:p>
     <w:p>
       <w:pPr>
-        <w:pStyle w:val="ListMain"/>
+        <w:pStyle w:val="ListParagraph"/>
+        <w:spacing w:line="360" w:lineRule="auto" w:before="0" w:after="0"/>
+        <w:ind w:firstLine="709"/>
         <w:jc w:val="both"/>
       </w:pPr>
       <w:r>
@@ -2255,12 +2477,14 @@
           <w:color w:val="000000"/>
           <w:sz w:val="28"/>
         </w:rPr>
-        <w:t>• Применение потокового шифрования через CryptoStream в режиме сцепления блоков (CBC) с вектором инициализации (IV).</w:t>
+        <w:t>— Применение потокового шифрования через CryptoStream в режиме сцепления блоков (CBC) с вектором инициализации (IV).</w:t>
       </w:r>
     </w:p>
     <w:p>
       <w:pPr>
-        <w:pStyle w:val="ListMain"/>
+        <w:pStyle w:val="ListParagraph"/>
+        <w:spacing w:line="360" w:lineRule="auto" w:before="0" w:after="0"/>
+        <w:ind w:firstLine="709"/>
         <w:jc w:val="both"/>
       </w:pPr>
       <w:r>
@@ -2270,12 +2494,14 @@
           <w:color w:val="000000"/>
           <w:sz w:val="28"/>
         </w:rPr>
-        <w:t>• Шифрование конфигурационного файла App.config со строкой подключения к SQLEXPRESS.</w:t>
+        <w:t>— Шифрование конфигурационного файла App.config со строкой подключения к SQLEXPRESS.</w:t>
       </w:r>
     </w:p>
     <w:p>
       <w:pPr>
-        <w:pStyle w:val="Headerlower"/>
+        <w:pStyle w:val="Heading2"/>
+        <w:spacing w:line="360" w:lineRule="auto" w:before="120" w:after="0"/>
+        <w:ind w:firstLine="709"/>
         <w:jc w:val="both"/>
       </w:pPr>
       <w:r>
@@ -2290,7 +2516,8 @@
     </w:p>
     <w:p>
       <w:pPr>
-        <w:pStyle w:val="Picturemain"/>
+        <w:spacing w:line="360" w:lineRule="auto" w:before="120" w:after="120"/>
+        <w:ind w:firstLine="0"/>
         <w:jc w:val="center"/>
       </w:pPr>
       <w:r>
@@ -2307,7 +2534,9 @@
     </w:p>
     <w:p>
       <w:pPr>
-        <w:pStyle w:val="Headerlower"/>
+        <w:pStyle w:val="Heading2"/>
+        <w:spacing w:line="360" w:lineRule="auto" w:before="120" w:after="0"/>
+        <w:ind w:firstLine="709"/>
         <w:jc w:val="both"/>
       </w:pPr>
       <w:r>
@@ -2322,7 +2551,8 @@
     </w:p>
     <w:p>
       <w:pPr>
-        <w:pStyle w:val="ParagraphMain"/>
+        <w:spacing w:line="360" w:lineRule="auto" w:before="0" w:after="0"/>
+        <w:ind w:firstLine="709"/>
         <w:jc w:val="both"/>
       </w:pPr>
       <w:r>
@@ -2337,8 +2567,10 @@
     </w:p>
     <w:p>
       <w:pPr>
-        <w:pStyle w:val="HeaderMain"/>
+        <w:pStyle w:val="Heading1"/>
         <w:pageBreakBefore/>
+        <w:spacing w:line="360" w:lineRule="auto" w:before="240" w:after="240"/>
+        <w:ind w:firstLine="0"/>
         <w:jc w:val="center"/>
       </w:pPr>
       <w:r>
@@ -2353,7 +2585,9 @@
     </w:p>
     <w:p>
       <w:pPr>
-        <w:pStyle w:val="Headerlower"/>
+        <w:pStyle w:val="Heading2"/>
+        <w:spacing w:line="360" w:lineRule="auto" w:before="120" w:after="0"/>
+        <w:ind w:firstLine="709"/>
         <w:jc w:val="both"/>
       </w:pPr>
       <w:r>
@@ -2368,7 +2602,8 @@
     </w:p>
     <w:p>
       <w:pPr>
-        <w:pStyle w:val="ParagraphMain"/>
+        <w:spacing w:line="360" w:lineRule="auto" w:before="0" w:after="0"/>
+        <w:ind w:firstLine="709"/>
         <w:jc w:val="both"/>
       </w:pPr>
       <w:r>
@@ -2383,7 +2618,9 @@
     </w:p>
     <w:p>
       <w:pPr>
-        <w:pStyle w:val="Headerlower"/>
+        <w:pStyle w:val="Heading2"/>
+        <w:spacing w:line="360" w:lineRule="auto" w:before="120" w:after="0"/>
+        <w:ind w:firstLine="709"/>
         <w:jc w:val="both"/>
       </w:pPr>
       <w:r>
@@ -2398,7 +2635,9 @@
     </w:p>
     <w:p>
       <w:pPr>
-        <w:pStyle w:val="ListMain"/>
+        <w:pStyle w:val="ListParagraph"/>
+        <w:spacing w:line="360" w:lineRule="auto" w:before="0" w:after="0"/>
+        <w:ind w:firstLine="709"/>
         <w:jc w:val="both"/>
       </w:pPr>
       <w:r>
@@ -2408,12 +2647,14 @@
           <w:color w:val="000000"/>
           <w:sz w:val="28"/>
         </w:rPr>
-        <w:t>• Анализ уязвимости хранения паролей в открытом виде (Plaintext) и методов защиты от атак по радужным таблицам (Rainbow Tables).</w:t>
+        <w:t>— Анализ уязвимости хранения паролей в открытом виде (Plaintext) и методов защиты от атак по радужным таблицам (Rainbow Tables).</w:t>
       </w:r>
     </w:p>
     <w:p>
       <w:pPr>
-        <w:pStyle w:val="ListMain"/>
+        <w:pStyle w:val="ListParagraph"/>
+        <w:spacing w:line="360" w:lineRule="auto" w:before="0" w:after="0"/>
+        <w:ind w:firstLine="709"/>
         <w:jc w:val="both"/>
       </w:pPr>
       <w:r>
@@ -2423,12 +2664,14 @@
           <w:color w:val="000000"/>
           <w:sz w:val="28"/>
         </w:rPr>
-        <w:t>• Реализация функции вычисления дайджеста пароля: конкатенация пароля и криптографически стойкой соли (Salt) с последующим хэшированием SHA-256.</w:t>
+        <w:t>— Реализация функции вычисления дайджеста пароля: конкатенация пароля и криптографически стойкой соли (Salt) с последующим хэшированием SHA-256.</w:t>
       </w:r>
     </w:p>
     <w:p>
       <w:pPr>
-        <w:pStyle w:val="ListMain"/>
+        <w:pStyle w:val="ListParagraph"/>
+        <w:spacing w:line="360" w:lineRule="auto" w:before="0" w:after="0"/>
+        <w:ind w:firstLine="709"/>
         <w:jc w:val="both"/>
       </w:pPr>
       <w:r>
@@ -2438,12 +2681,14 @@
           <w:color w:val="000000"/>
           <w:sz w:val="28"/>
         </w:rPr>
-        <w:t>• Модификация таблицы Users в базе данных для хранения столбцов PasswordHash (nvarchar(64)) и Salt (nvarchar(32)).</w:t>
+        <w:t>— Модификация таблицы Users в базе данных для хранения столбцов PasswordHash (nvarchar(64)) и Salt (nvarchar(32)).</w:t>
       </w:r>
     </w:p>
     <w:p>
       <w:pPr>
-        <w:pStyle w:val="ListMain"/>
+        <w:pStyle w:val="ListParagraph"/>
+        <w:spacing w:line="360" w:lineRule="auto" w:before="0" w:after="0"/>
+        <w:ind w:firstLine="709"/>
         <w:jc w:val="both"/>
       </w:pPr>
       <w:r>
@@ -2453,12 +2698,14 @@
           <w:color w:val="000000"/>
           <w:sz w:val="28"/>
         </w:rPr>
-        <w:t>• Интеграция функции сверки хэша при авторизации пользователя в ИС.</w:t>
+        <w:t>— Интеграция функции сверки хэша при авторизации пользователя в ИС.</w:t>
       </w:r>
     </w:p>
     <w:p>
       <w:pPr>
-        <w:pStyle w:val="Headerlower"/>
+        <w:pStyle w:val="Heading2"/>
+        <w:spacing w:line="360" w:lineRule="auto" w:before="120" w:after="0"/>
+        <w:ind w:firstLine="709"/>
         <w:jc w:val="both"/>
       </w:pPr>
       <w:r>
@@ -2473,7 +2720,8 @@
     </w:p>
     <w:p>
       <w:pPr>
-        <w:pStyle w:val="Picturemain"/>
+        <w:spacing w:line="360" w:lineRule="auto" w:before="120" w:after="120"/>
+        <w:ind w:firstLine="0"/>
         <w:jc w:val="center"/>
       </w:pPr>
       <w:r>
@@ -2490,7 +2738,9 @@
     </w:p>
     <w:p>
       <w:pPr>
-        <w:pStyle w:val="Headerlower"/>
+        <w:pStyle w:val="Heading2"/>
+        <w:spacing w:line="360" w:lineRule="auto" w:before="120" w:after="0"/>
+        <w:ind w:firstLine="709"/>
         <w:jc w:val="both"/>
       </w:pPr>
       <w:r>
@@ -2505,7 +2755,8 @@
     </w:p>
     <w:p>
       <w:pPr>
-        <w:pStyle w:val="ParagraphMain"/>
+        <w:spacing w:line="360" w:lineRule="auto" w:before="0" w:after="0"/>
+        <w:ind w:firstLine="709"/>
         <w:jc w:val="both"/>
       </w:pPr>
       <w:r>
@@ -2520,8 +2771,10 @@
     </w:p>
     <w:p>
       <w:pPr>
-        <w:pStyle w:val="HeaderMain"/>
+        <w:pStyle w:val="Heading1"/>
         <w:pageBreakBefore/>
+        <w:spacing w:line="360" w:lineRule="auto" w:before="240" w:after="240"/>
+        <w:ind w:firstLine="0"/>
         <w:jc w:val="center"/>
       </w:pPr>
       <w:r>
@@ -2536,7 +2789,9 @@
     </w:p>
     <w:p>
       <w:pPr>
-        <w:pStyle w:val="Headerlower"/>
+        <w:pStyle w:val="Heading2"/>
+        <w:spacing w:line="360" w:lineRule="auto" w:before="120" w:after="0"/>
+        <w:ind w:firstLine="709"/>
         <w:jc w:val="both"/>
       </w:pPr>
       <w:r>
@@ -2551,7 +2806,8 @@
     </w:p>
     <w:p>
       <w:pPr>
-        <w:pStyle w:val="ParagraphMain"/>
+        <w:spacing w:line="360" w:lineRule="auto" w:before="0" w:after="0"/>
+        <w:ind w:firstLine="709"/>
         <w:jc w:val="both"/>
       </w:pPr>
       <w:r>
@@ -2566,7 +2822,9 @@
     </w:p>
     <w:p>
       <w:pPr>
-        <w:pStyle w:val="Headerlower"/>
+        <w:pStyle w:val="Heading2"/>
+        <w:spacing w:line="360" w:lineRule="auto" w:before="120" w:after="0"/>
+        <w:ind w:firstLine="709"/>
         <w:jc w:val="both"/>
       </w:pPr>
       <w:r>
@@ -2581,7 +2839,9 @@
     </w:p>
     <w:p>
       <w:pPr>
-        <w:pStyle w:val="ListMain"/>
+        <w:pStyle w:val="ListParagraph"/>
+        <w:spacing w:line="360" w:lineRule="auto" w:before="0" w:after="0"/>
+        <w:ind w:firstLine="709"/>
         <w:jc w:val="both"/>
       </w:pPr>
       <w:r>
@@ -2591,12 +2851,14 @@
           <w:color w:val="000000"/>
           <w:sz w:val="28"/>
         </w:rPr>
-        <w:t>• Инициализация локального репозитория в корне проекта командой git init.</w:t>
+        <w:t>— Инициализация локального репозитория в корне проекта командой git init.</w:t>
       </w:r>
     </w:p>
     <w:p>
       <w:pPr>
-        <w:pStyle w:val="ListMain"/>
+        <w:pStyle w:val="ListParagraph"/>
+        <w:spacing w:line="360" w:lineRule="auto" w:before="0" w:after="0"/>
+        <w:ind w:firstLine="709"/>
         <w:jc w:val="both"/>
       </w:pPr>
       <w:r>
@@ -2606,12 +2868,14 @@
           <w:color w:val="000000"/>
           <w:sz w:val="28"/>
         </w:rPr>
-        <w:t>• Создание профессионального файла .gitignore: исключение служебных папок .vs/, bin/, obj/, временных файлов сборщика и локальных БД (.mdf/.ldf).</w:t>
+        <w:t>— Создание профессионального файла .gitignore: исключение служебных папок .vs/, bin/, obj/, временных файлов сборщика и локальных БД (.mdf/.ldf).</w:t>
       </w:r>
     </w:p>
     <w:p>
       <w:pPr>
-        <w:pStyle w:val="ListMain"/>
+        <w:pStyle w:val="ListParagraph"/>
+        <w:spacing w:line="360" w:lineRule="auto" w:before="0" w:after="0"/>
+        <w:ind w:firstLine="709"/>
         <w:jc w:val="both"/>
       </w:pPr>
       <w:r>
@@ -2621,12 +2885,14 @@
           <w:color w:val="000000"/>
           <w:sz w:val="28"/>
         </w:rPr>
-        <w:t>• Формирование базовых коммитов проекта по стандарту Conventional Commits (feat, fix, docs, chore).</w:t>
+        <w:t>— Формирование базовых коммитов проекта по стандарту Conventional Commits (feat, fix, docs, chore).</w:t>
       </w:r>
     </w:p>
     <w:p>
       <w:pPr>
-        <w:pStyle w:val="ListMain"/>
+        <w:pStyle w:val="ListParagraph"/>
+        <w:spacing w:line="360" w:lineRule="auto" w:before="0" w:after="0"/>
+        <w:ind w:firstLine="709"/>
         <w:jc w:val="both"/>
       </w:pPr>
       <w:r>
@@ -2636,12 +2902,14 @@
           <w:color w:val="000000"/>
           <w:sz w:val="28"/>
         </w:rPr>
-        <w:t>• Просмотр истории репозитория с помощью команд git status и git log --oneline.</w:t>
+        <w:t>— Просмотр истории репозитория с помощью команд git status и git log --oneline.</w:t>
       </w:r>
     </w:p>
     <w:p>
       <w:pPr>
-        <w:pStyle w:val="Headerlower"/>
+        <w:pStyle w:val="Heading2"/>
+        <w:spacing w:line="360" w:lineRule="auto" w:before="120" w:after="0"/>
+        <w:ind w:firstLine="709"/>
         <w:jc w:val="both"/>
       </w:pPr>
       <w:r>
@@ -2656,7 +2924,8 @@
     </w:p>
     <w:p>
       <w:pPr>
-        <w:pStyle w:val="Picturemain"/>
+        <w:spacing w:line="360" w:lineRule="auto" w:before="120" w:after="120"/>
+        <w:ind w:firstLine="0"/>
         <w:jc w:val="center"/>
       </w:pPr>
       <w:r>
@@ -2673,7 +2942,9 @@
     </w:p>
     <w:p>
       <w:pPr>
-        <w:pStyle w:val="Headerlower"/>
+        <w:pStyle w:val="Heading2"/>
+        <w:spacing w:line="360" w:lineRule="auto" w:before="120" w:after="0"/>
+        <w:ind w:firstLine="709"/>
         <w:jc w:val="both"/>
       </w:pPr>
       <w:r>
@@ -2688,7 +2959,8 @@
     </w:p>
     <w:p>
       <w:pPr>
-        <w:pStyle w:val="ParagraphMain"/>
+        <w:spacing w:line="360" w:lineRule="auto" w:before="0" w:after="0"/>
+        <w:ind w:firstLine="709"/>
         <w:jc w:val="both"/>
       </w:pPr>
       <w:r>
@@ -2703,8 +2975,10 @@
     </w:p>
     <w:p>
       <w:pPr>
-        <w:pStyle w:val="HeaderMain"/>
+        <w:pStyle w:val="Heading1"/>
         <w:pageBreakBefore/>
+        <w:spacing w:line="360" w:lineRule="auto" w:before="240" w:after="240"/>
+        <w:ind w:firstLine="0"/>
         <w:jc w:val="center"/>
       </w:pPr>
       <w:r>
@@ -2719,7 +2993,9 @@
     </w:p>
     <w:p>
       <w:pPr>
-        <w:pStyle w:val="Headerlower"/>
+        <w:pStyle w:val="Heading2"/>
+        <w:spacing w:line="360" w:lineRule="auto" w:before="120" w:after="0"/>
+        <w:ind w:firstLine="709"/>
         <w:jc w:val="both"/>
       </w:pPr>
       <w:r>
@@ -2734,7 +3010,8 @@
     </w:p>
     <w:p>
       <w:pPr>
-        <w:pStyle w:val="ParagraphMain"/>
+        <w:spacing w:line="360" w:lineRule="auto" w:before="0" w:after="0"/>
+        <w:ind w:firstLine="709"/>
         <w:jc w:val="both"/>
       </w:pPr>
       <w:r>
@@ -2749,7 +3026,9 @@
     </w:p>
     <w:p>
       <w:pPr>
-        <w:pStyle w:val="Headerlower"/>
+        <w:pStyle w:val="Heading2"/>
+        <w:spacing w:line="360" w:lineRule="auto" w:before="120" w:after="0"/>
+        <w:ind w:firstLine="709"/>
         <w:jc w:val="both"/>
       </w:pPr>
       <w:r>
@@ -2764,7 +3043,9 @@
     </w:p>
     <w:p>
       <w:pPr>
-        <w:pStyle w:val="ListMain"/>
+        <w:pStyle w:val="ListParagraph"/>
+        <w:spacing w:line="360" w:lineRule="auto" w:before="0" w:after="0"/>
+        <w:ind w:firstLine="709"/>
         <w:jc w:val="both"/>
       </w:pPr>
       <w:r>
@@ -2774,12 +3055,14 @@
           <w:color w:val="000000"/>
           <w:sz w:val="28"/>
         </w:rPr>
-        <w:t>• Создание изолированных функциональных веток: git branch feature/auth и git branch feature/master-detail.</w:t>
+        <w:t>— Создание изолированных функциональных веток: git branch feature/auth и git branch feature/master-detail.</w:t>
       </w:r>
     </w:p>
     <w:p>
       <w:pPr>
-        <w:pStyle w:val="ListMain"/>
+        <w:pStyle w:val="ListParagraph"/>
+        <w:spacing w:line="360" w:lineRule="auto" w:before="0" w:after="0"/>
+        <w:ind w:firstLine="709"/>
         <w:jc w:val="both"/>
       </w:pPr>
       <w:r>
@@ -2789,12 +3072,14 @@
           <w:color w:val="000000"/>
           <w:sz w:val="28"/>
         </w:rPr>
-        <w:t>• Параллельная модификация файлов формы и схемы DataSet в разных ветках с последующим коммитом.</w:t>
+        <w:t>— Параллельная модификация файлов формы и схемы DataSet в разных ветках с последующим коммитом.</w:t>
       </w:r>
     </w:p>
     <w:p>
       <w:pPr>
-        <w:pStyle w:val="ListMain"/>
+        <w:pStyle w:val="ListParagraph"/>
+        <w:spacing w:line="360" w:lineRule="auto" w:before="0" w:after="0"/>
+        <w:ind w:firstLine="709"/>
         <w:jc w:val="both"/>
       </w:pPr>
       <w:r>
@@ -2804,12 +3089,14 @@
           <w:color w:val="000000"/>
           <w:sz w:val="28"/>
         </w:rPr>
-        <w:t>• Моделирование конфликта слияния (Merge Conflict) при попытке слияния ветки в master.</w:t>
+        <w:t>— Моделирование конфликта слияния (Merge Conflict) при попытке слияния ветки в master.</w:t>
       </w:r>
     </w:p>
     <w:p>
       <w:pPr>
-        <w:pStyle w:val="ListMain"/>
+        <w:pStyle w:val="ListParagraph"/>
+        <w:spacing w:line="360" w:lineRule="auto" w:before="0" w:after="0"/>
+        <w:ind w:firstLine="709"/>
         <w:jc w:val="both"/>
       </w:pPr>
       <w:r>
@@ -2819,12 +3106,14 @@
           <w:color w:val="000000"/>
           <w:sz w:val="28"/>
         </w:rPr>
-        <w:t>• Ручной разбор и разрешение конфликта маркеров &lt;&lt;&lt;&lt;&lt;&lt;&lt; HEAD, фиксация мерж-коммита и просмотр графа коммитов (git log --graph).</w:t>
+        <w:t>— Ручной разбор и разрешение конфликта маркеров &lt;&lt;&lt;&lt;&lt;&lt;&lt; HEAD, фиксация мерж-коммита и просмотр графа коммитов (git log --graph).</w:t>
       </w:r>
     </w:p>
     <w:p>
       <w:pPr>
-        <w:pStyle w:val="Headerlower"/>
+        <w:pStyle w:val="Heading2"/>
+        <w:spacing w:line="360" w:lineRule="auto" w:before="120" w:after="0"/>
+        <w:ind w:firstLine="709"/>
         <w:jc w:val="both"/>
       </w:pPr>
       <w:r>
@@ -2839,7 +3128,8 @@
     </w:p>
     <w:p>
       <w:pPr>
-        <w:pStyle w:val="Picturemain"/>
+        <w:spacing w:line="360" w:lineRule="auto" w:before="120" w:after="120"/>
+        <w:ind w:firstLine="0"/>
         <w:jc w:val="center"/>
       </w:pPr>
       <w:r>
@@ -2856,7 +3146,9 @@
     </w:p>
     <w:p>
       <w:pPr>
-        <w:pStyle w:val="Headerlower"/>
+        <w:pStyle w:val="Heading2"/>
+        <w:spacing w:line="360" w:lineRule="auto" w:before="120" w:after="0"/>
+        <w:ind w:firstLine="709"/>
         <w:jc w:val="both"/>
       </w:pPr>
       <w:r>
@@ -2871,7 +3163,8 @@
     </w:p>
     <w:p>
       <w:pPr>
-        <w:pStyle w:val="ParagraphMain"/>
+        <w:spacing w:line="360" w:lineRule="auto" w:before="0" w:after="0"/>
+        <w:ind w:firstLine="709"/>
         <w:jc w:val="both"/>
       </w:pPr>
       <w:r>
@@ -2886,8 +3179,10 @@
     </w:p>
     <w:p>
       <w:pPr>
-        <w:pStyle w:val="HeaderMain"/>
+        <w:pStyle w:val="Heading1"/>
         <w:pageBreakBefore/>
+        <w:spacing w:line="360" w:lineRule="auto" w:before="240" w:after="240"/>
+        <w:ind w:firstLine="0"/>
         <w:jc w:val="center"/>
       </w:pPr>
       <w:r>
@@ -2902,7 +3197,9 @@
     </w:p>
     <w:p>
       <w:pPr>
-        <w:pStyle w:val="Headerlower"/>
+        <w:pStyle w:val="Heading2"/>
+        <w:spacing w:line="360" w:lineRule="auto" w:before="120" w:after="0"/>
+        <w:ind w:firstLine="709"/>
         <w:jc w:val="both"/>
       </w:pPr>
       <w:r>
@@ -2917,7 +3214,8 @@
     </w:p>
     <w:p>
       <w:pPr>
-        <w:pStyle w:val="ParagraphMain"/>
+        <w:spacing w:line="360" w:lineRule="auto" w:before="0" w:after="0"/>
+        <w:ind w:firstLine="709"/>
         <w:jc w:val="both"/>
       </w:pPr>
       <w:r>
@@ -2932,7 +3230,9 @@
     </w:p>
     <w:p>
       <w:pPr>
-        <w:pStyle w:val="Headerlower"/>
+        <w:pStyle w:val="Heading2"/>
+        <w:spacing w:line="360" w:lineRule="auto" w:before="120" w:after="0"/>
+        <w:ind w:firstLine="709"/>
         <w:jc w:val="both"/>
       </w:pPr>
       <w:r>
@@ -2947,7 +3247,9 @@
     </w:p>
     <w:p>
       <w:pPr>
-        <w:pStyle w:val="ListMain"/>
+        <w:pStyle w:val="ListParagraph"/>
+        <w:spacing w:line="360" w:lineRule="auto" w:before="0" w:after="0"/>
+        <w:ind w:firstLine="709"/>
         <w:jc w:val="both"/>
       </w:pPr>
       <w:r>
@@ -2957,12 +3259,14 @@
           <w:color w:val="000000"/>
           <w:sz w:val="28"/>
         </w:rPr>
-        <w:t>• Наследование главной формы от базового класса MaterialSkin.Controls.MaterialForm, настройка цветовой схемы MaterialSkinManager.</w:t>
+        <w:t>— Наследование главной формы от базового класса MaterialSkin.Controls.MaterialForm, настройка цветовой схемы MaterialSkinManager.</w:t>
       </w:r>
     </w:p>
     <w:p>
       <w:pPr>
-        <w:pStyle w:val="ListMain"/>
+        <w:pStyle w:val="ListParagraph"/>
+        <w:spacing w:line="360" w:lineRule="auto" w:before="0" w:after="0"/>
+        <w:ind w:firstLine="709"/>
         <w:jc w:val="both"/>
       </w:pPr>
       <w:r>
@@ -2972,12 +3276,14 @@
           <w:color w:val="000000"/>
           <w:sz w:val="28"/>
         </w:rPr>
-        <w:t>• Размещение компонентов MaterialCard, MaterialTextBox (стиль Hint), MaterialButton для создания современного плоского дизайна.</w:t>
+        <w:t>— Размещение компонентов MaterialCard, MaterialTextBox (стиль Hint), MaterialButton для создания современного плоского дизайна.</w:t>
       </w:r>
     </w:p>
     <w:p>
       <w:pPr>
-        <w:pStyle w:val="ListMain"/>
+        <w:pStyle w:val="ListParagraph"/>
+        <w:spacing w:line="360" w:lineRule="auto" w:before="0" w:after="0"/>
+        <w:ind w:firstLine="709"/>
         <w:jc w:val="both"/>
       </w:pPr>
       <w:r>
@@ -2987,12 +3293,14 @@
           <w:color w:val="000000"/>
           <w:sz w:val="28"/>
         </w:rPr>
-        <w:t>• Реализация логики проверки учетных данных: сверка логина и хэша пароля по таблице Users.</w:t>
+        <w:t>— Реализация логики проверки учетных данных: сверка логина и хэша пароля по таблице Users.</w:t>
       </w:r>
     </w:p>
     <w:p>
       <w:pPr>
-        <w:pStyle w:val="ListMain"/>
+        <w:pStyle w:val="ListParagraph"/>
+        <w:spacing w:line="360" w:lineRule="auto" w:before="0" w:after="0"/>
+        <w:ind w:firstLine="709"/>
         <w:jc w:val="both"/>
       </w:pPr>
       <w:r>
@@ -3002,12 +3310,14 @@
           <w:color w:val="000000"/>
           <w:sz w:val="28"/>
         </w:rPr>
-        <w:t>• Реализация ролевой модели доступа: определение прав (Администратор — полный доступ к справочникам, Оператор — работа с реестрами).</w:t>
+        <w:t>— Реализация ролевой модели доступа: определение прав (Администратор — полный доступ к справочникам, Оператор — работа с реестрами).</w:t>
       </w:r>
     </w:p>
     <w:p>
       <w:pPr>
-        <w:pStyle w:val="Headerlower"/>
+        <w:pStyle w:val="Heading2"/>
+        <w:spacing w:line="360" w:lineRule="auto" w:before="120" w:after="0"/>
+        <w:ind w:firstLine="709"/>
         <w:jc w:val="both"/>
       </w:pPr>
       <w:r>
@@ -3022,7 +3332,8 @@
     </w:p>
     <w:p>
       <w:pPr>
-        <w:pStyle w:val="Picturemain"/>
+        <w:spacing w:line="360" w:lineRule="auto" w:before="120" w:after="120"/>
+        <w:ind w:firstLine="0"/>
         <w:jc w:val="center"/>
       </w:pPr>
       <w:r>
@@ -3039,7 +3350,9 @@
     </w:p>
     <w:p>
       <w:pPr>
-        <w:pStyle w:val="Headerlower"/>
+        <w:pStyle w:val="Heading2"/>
+        <w:spacing w:line="360" w:lineRule="auto" w:before="120" w:after="0"/>
+        <w:ind w:firstLine="709"/>
         <w:jc w:val="both"/>
       </w:pPr>
       <w:r>
@@ -3054,7 +3367,8 @@
     </w:p>
     <w:p>
       <w:pPr>
-        <w:pStyle w:val="ParagraphMain"/>
+        <w:spacing w:line="360" w:lineRule="auto" w:before="0" w:after="0"/>
+        <w:ind w:firstLine="709"/>
         <w:jc w:val="both"/>
       </w:pPr>
       <w:r>
@@ -3069,8 +3383,10 @@
     </w:p>
     <w:p>
       <w:pPr>
-        <w:pStyle w:val="HeaderMain"/>
+        <w:pStyle w:val="Heading1"/>
         <w:pageBreakBefore/>
+        <w:spacing w:line="360" w:lineRule="auto" w:before="240" w:after="240"/>
+        <w:ind w:firstLine="0"/>
         <w:jc w:val="center"/>
       </w:pPr>
       <w:r>
@@ -3085,7 +3401,9 @@
     </w:p>
     <w:p>
       <w:pPr>
-        <w:pStyle w:val="Headerlower"/>
+        <w:pStyle w:val="Heading2"/>
+        <w:spacing w:line="360" w:lineRule="auto" w:before="120" w:after="0"/>
+        <w:ind w:firstLine="709"/>
         <w:jc w:val="both"/>
       </w:pPr>
       <w:r>
@@ -3100,7 +3418,8 @@
     </w:p>
     <w:p>
       <w:pPr>
-        <w:pStyle w:val="ParagraphMain"/>
+        <w:spacing w:line="360" w:lineRule="auto" w:before="0" w:after="0"/>
+        <w:ind w:firstLine="709"/>
         <w:jc w:val="both"/>
       </w:pPr>
       <w:r>
@@ -3115,7 +3434,9 @@
     </w:p>
     <w:p>
       <w:pPr>
-        <w:pStyle w:val="Headerlower"/>
+        <w:pStyle w:val="Heading2"/>
+        <w:spacing w:line="360" w:lineRule="auto" w:before="120" w:after="0"/>
+        <w:ind w:firstLine="709"/>
         <w:jc w:val="both"/>
       </w:pPr>
       <w:r>
@@ -3130,7 +3451,9 @@
     </w:p>
     <w:p>
       <w:pPr>
-        <w:pStyle w:val="ListMain"/>
+        <w:pStyle w:val="ListParagraph"/>
+        <w:spacing w:line="360" w:lineRule="auto" w:before="0" w:after="0"/>
+        <w:ind w:firstLine="709"/>
         <w:jc w:val="both"/>
       </w:pPr>
       <w:r>
@@ -3140,12 +3463,14 @@
           <w:color w:val="000000"/>
           <w:sz w:val="28"/>
         </w:rPr>
-        <w:t>• Подключение базы данных проекта через окно Data Sources Visual Studio с генерацией типизированного DataSet (.xsd).</w:t>
+        <w:t>— Подключение базы данных проекта через окно Data Sources Visual Studio с генерацией типизированного DataSet (.xsd).</w:t>
       </w:r>
     </w:p>
     <w:p>
       <w:pPr>
-        <w:pStyle w:val="ListMain"/>
+        <w:pStyle w:val="ListParagraph"/>
+        <w:spacing w:line="360" w:lineRule="auto" w:before="0" w:after="0"/>
+        <w:ind w:firstLine="709"/>
         <w:jc w:val="both"/>
       </w:pPr>
       <w:r>
@@ -3155,12 +3480,14 @@
           <w:color w:val="000000"/>
           <w:sz w:val="28"/>
         </w:rPr>
-        <w:t>• Создание связей отношений (DataRelation) между родительскими и дочерними таблицами варианта (FK Challenge).</w:t>
+        <w:t>— Создание связей отношений (DataRelation) между родительскими и дочерними таблицами варианта (FK Challenge).</w:t>
       </w:r>
     </w:p>
     <w:p>
       <w:pPr>
-        <w:pStyle w:val="ListMain"/>
+        <w:pStyle w:val="ListParagraph"/>
+        <w:spacing w:line="360" w:lineRule="auto" w:before="0" w:after="0"/>
+        <w:ind w:firstLine="709"/>
         <w:jc w:val="both"/>
       </w:pPr>
       <w:r>
@@ -3170,12 +3497,14 @@
           <w:color w:val="000000"/>
           <w:sz w:val="28"/>
         </w:rPr>
-        <w:t>• Организация интерфейса Master-Detail: синхронизация верхнего грида (родительские записи) и нижнего грида (дочерняя спецификация).</w:t>
+        <w:t>— Организация интерфейса Master-Detail: синхронизация верхнего грида (родительские записи) и нижнего грида (дочерняя спецификация).</w:t>
       </w:r>
     </w:p>
     <w:p>
       <w:pPr>
-        <w:pStyle w:val="ListMain"/>
+        <w:pStyle w:val="ListParagraph"/>
+        <w:spacing w:line="360" w:lineRule="auto" w:before="0" w:after="0"/>
+        <w:ind w:firstLine="709"/>
         <w:jc w:val="both"/>
       </w:pPr>
       <w:r>
@@ -3185,12 +3514,14 @@
           <w:color w:val="000000"/>
           <w:sz w:val="28"/>
         </w:rPr>
-        <w:t>• Использование компонентов BindingSource и связывание дочернего BindingSource с отношением родительской таблицы.</w:t>
+        <w:t>— Использование компонентов BindingSource и связывание дочернего BindingSource с отношением родительской таблицы.</w:t>
       </w:r>
     </w:p>
     <w:p>
       <w:pPr>
-        <w:pStyle w:val="Headerlower"/>
+        <w:pStyle w:val="Heading2"/>
+        <w:spacing w:line="360" w:lineRule="auto" w:before="120" w:after="0"/>
+        <w:ind w:firstLine="709"/>
         <w:jc w:val="both"/>
       </w:pPr>
       <w:r>
@@ -3205,7 +3536,8 @@
     </w:p>
     <w:p>
       <w:pPr>
-        <w:pStyle w:val="Picturemain"/>
+        <w:spacing w:line="360" w:lineRule="auto" w:before="120" w:after="120"/>
+        <w:ind w:firstLine="0"/>
         <w:jc w:val="center"/>
       </w:pPr>
       <w:r>
@@ -3222,7 +3554,9 @@
     </w:p>
     <w:p>
       <w:pPr>
-        <w:pStyle w:val="Headerlower"/>
+        <w:pStyle w:val="Heading2"/>
+        <w:spacing w:line="360" w:lineRule="auto" w:before="120" w:after="0"/>
+        <w:ind w:firstLine="709"/>
         <w:jc w:val="both"/>
       </w:pPr>
       <w:r>
@@ -3237,7 +3571,8 @@
     </w:p>
     <w:p>
       <w:pPr>
-        <w:pStyle w:val="ParagraphMain"/>
+        <w:spacing w:line="360" w:lineRule="auto" w:before="0" w:after="0"/>
+        <w:ind w:firstLine="709"/>
         <w:jc w:val="both"/>
       </w:pPr>
       <w:r>
@@ -3252,8 +3587,10 @@
     </w:p>
     <w:p>
       <w:pPr>
-        <w:pStyle w:val="HeaderMain"/>
+        <w:pStyle w:val="Heading1"/>
         <w:pageBreakBefore/>
+        <w:spacing w:line="360" w:lineRule="auto" w:before="240" w:after="240"/>
+        <w:ind w:firstLine="0"/>
         <w:jc w:val="center"/>
       </w:pPr>
       <w:r>
@@ -3268,7 +3605,9 @@
     </w:p>
     <w:p>
       <w:pPr>
-        <w:pStyle w:val="Headerlower"/>
+        <w:pStyle w:val="Heading2"/>
+        <w:spacing w:line="360" w:lineRule="auto" w:before="120" w:after="0"/>
+        <w:ind w:firstLine="709"/>
         <w:jc w:val="both"/>
       </w:pPr>
       <w:r>
@@ -3283,7 +3622,8 @@
     </w:p>
     <w:p>
       <w:pPr>
-        <w:pStyle w:val="ParagraphMain"/>
+        <w:spacing w:line="360" w:lineRule="auto" w:before="0" w:after="0"/>
+        <w:ind w:firstLine="709"/>
         <w:jc w:val="both"/>
       </w:pPr>
       <w:r>
@@ -3298,7 +3638,9 @@
     </w:p>
     <w:p>
       <w:pPr>
-        <w:pStyle w:val="Headerlower"/>
+        <w:pStyle w:val="Heading2"/>
+        <w:spacing w:line="360" w:lineRule="auto" w:before="120" w:after="0"/>
+        <w:ind w:firstLine="709"/>
         <w:jc w:val="both"/>
       </w:pPr>
       <w:r>
@@ -3313,7 +3655,9 @@
     </w:p>
     <w:p>
       <w:pPr>
-        <w:pStyle w:val="ListMain"/>
+        <w:pStyle w:val="ListParagraph"/>
+        <w:spacing w:line="360" w:lineRule="auto" w:before="0" w:after="0"/>
+        <w:ind w:firstLine="709"/>
         <w:jc w:val="both"/>
       </w:pPr>
       <w:r>
@@ -3323,12 +3667,14 @@
           <w:color w:val="000000"/>
           <w:sz w:val="28"/>
         </w:rPr>
-        <w:t>• Реализация диалоговых окон добавления и редактирования записей с валидацией пользовательского ввода (ErrorProvider).</w:t>
+        <w:t>— Реализация диалоговых окон добавления и редактирования записей с валидацией пользовательского ввода (ErrorProvider).</w:t>
       </w:r>
     </w:p>
     <w:p>
       <w:pPr>
-        <w:pStyle w:val="ListMain"/>
+        <w:pStyle w:val="ListParagraph"/>
+        <w:spacing w:line="360" w:lineRule="auto" w:before="0" w:after="0"/>
+        <w:ind w:firstLine="709"/>
         <w:jc w:val="both"/>
       </w:pPr>
       <w:r>
@@ -3338,12 +3684,14 @@
           <w:color w:val="000000"/>
           <w:sz w:val="28"/>
         </w:rPr>
-        <w:t>• Вызовы методов адаптера данных TableAdapter.Insert(), TableAdapter.Update(), TableAdapter.Delete() и вызов TableAdapterManager.UpdateAll().</w:t>
+        <w:t>— Вызовы методов адаптера данных TableAdapter.Insert(), TableAdapter.Update(), TableAdapter.Delete() и вызов TableAdapterManager.UpdateAll().</w:t>
       </w:r>
     </w:p>
     <w:p>
       <w:pPr>
-        <w:pStyle w:val="ListMain"/>
+        <w:pStyle w:val="ListParagraph"/>
+        <w:spacing w:line="360" w:lineRule="auto" w:before="0" w:after="0"/>
+        <w:ind w:firstLine="709"/>
         <w:jc w:val="both"/>
       </w:pPr>
       <w:r>
@@ -3353,12 +3701,14 @@
           <w:color w:val="000000"/>
           <w:sz w:val="28"/>
         </w:rPr>
-        <w:t>• Реализация мгновенного «живого» поиска и фильтрации данных по подстроке через свойство BindingSource.Filter (выражения RowFilter).</w:t>
+        <w:t>— Реализация мгновенного «живого» поиска и фильтрации данных по подстроке через свойство BindingSource.Filter (выражения RowFilter).</w:t>
       </w:r>
     </w:p>
     <w:p>
       <w:pPr>
-        <w:pStyle w:val="ListMain"/>
+        <w:pStyle w:val="ListParagraph"/>
+        <w:spacing w:line="360" w:lineRule="auto" w:before="0" w:after="0"/>
+        <w:ind w:firstLine="709"/>
         <w:jc w:val="both"/>
       </w:pPr>
       <w:r>
@@ -3368,12 +3718,14 @@
           <w:color w:val="000000"/>
           <w:sz w:val="28"/>
         </w:rPr>
-        <w:t>• Обработка подтверждения удаления записей и обработка ошибок ссылочной целостности (FK constraint violations).</w:t>
+        <w:t>— Обработка подтверждения удаления записей и обработка ошибок ссылочной целостности (FK constraint violations).</w:t>
       </w:r>
     </w:p>
     <w:p>
       <w:pPr>
-        <w:pStyle w:val="Headerlower"/>
+        <w:pStyle w:val="Heading2"/>
+        <w:spacing w:line="360" w:lineRule="auto" w:before="120" w:after="0"/>
+        <w:ind w:firstLine="709"/>
         <w:jc w:val="both"/>
       </w:pPr>
       <w:r>
@@ -3388,7 +3740,8 @@
     </w:p>
     <w:p>
       <w:pPr>
-        <w:pStyle w:val="Picturemain"/>
+        <w:spacing w:line="360" w:lineRule="auto" w:before="120" w:after="120"/>
+        <w:ind w:firstLine="0"/>
         <w:jc w:val="center"/>
       </w:pPr>
       <w:r>
@@ -3405,7 +3758,9 @@
     </w:p>
     <w:p>
       <w:pPr>
-        <w:pStyle w:val="Headerlower"/>
+        <w:pStyle w:val="Heading2"/>
+        <w:spacing w:line="360" w:lineRule="auto" w:before="120" w:after="0"/>
+        <w:ind w:firstLine="709"/>
         <w:jc w:val="both"/>
       </w:pPr>
       <w:r>
@@ -3420,7 +3775,8 @@
     </w:p>
     <w:p>
       <w:pPr>
-        <w:pStyle w:val="ParagraphMain"/>
+        <w:spacing w:line="360" w:lineRule="auto" w:before="0" w:after="0"/>
+        <w:ind w:firstLine="709"/>
         <w:jc w:val="both"/>
       </w:pPr>
       <w:r>
@@ -3435,8 +3791,10 @@
     </w:p>
     <w:p>
       <w:pPr>
-        <w:pStyle w:val="HeaderMain"/>
+        <w:pStyle w:val="Heading1"/>
         <w:pageBreakBefore/>
+        <w:spacing w:line="360" w:lineRule="auto" w:before="240" w:after="240"/>
+        <w:ind w:firstLine="0"/>
         <w:jc w:val="center"/>
       </w:pPr>
       <w:r>
@@ -3451,7 +3809,9 @@
     </w:p>
     <w:p>
       <w:pPr>
-        <w:pStyle w:val="Headerlower"/>
+        <w:pStyle w:val="Heading2"/>
+        <w:spacing w:line="360" w:lineRule="auto" w:before="120" w:after="0"/>
+        <w:ind w:firstLine="709"/>
         <w:jc w:val="both"/>
       </w:pPr>
       <w:r>
@@ -3466,7 +3826,8 @@
     </w:p>
     <w:p>
       <w:pPr>
-        <w:pStyle w:val="ParagraphMain"/>
+        <w:spacing w:line="360" w:lineRule="auto" w:before="0" w:after="0"/>
+        <w:ind w:firstLine="709"/>
         <w:jc w:val="both"/>
       </w:pPr>
       <w:r>
@@ -3481,7 +3842,9 @@
     </w:p>
     <w:p>
       <w:pPr>
-        <w:pStyle w:val="Headerlower"/>
+        <w:pStyle w:val="Heading2"/>
+        <w:spacing w:line="360" w:lineRule="auto" w:before="120" w:after="0"/>
+        <w:ind w:firstLine="709"/>
         <w:jc w:val="both"/>
       </w:pPr>
       <w:r>
@@ -3496,7 +3859,9 @@
     </w:p>
     <w:p>
       <w:pPr>
-        <w:pStyle w:val="ListMain"/>
+        <w:pStyle w:val="ListParagraph"/>
+        <w:spacing w:line="360" w:lineRule="auto" w:before="0" w:after="0"/>
+        <w:ind w:firstLine="709"/>
         <w:jc w:val="both"/>
       </w:pPr>
       <w:r>
@@ -3506,12 +3871,14 @@
           <w:color w:val="000000"/>
           <w:sz w:val="28"/>
         </w:rPr>
-        <w:t>• Реализация сервисной функции создания полного бэкапа базы данных T-SQL командой BACKUP DATABASE ... TO DISK из интерфейса ИС.</w:t>
+        <w:t>— Реализация сервисной функции создания полного бэкапа базы данных T-SQL командой BACKUP DATABASE ... TO DISK из интерфейса ИС.</w:t>
       </w:r>
     </w:p>
     <w:p>
       <w:pPr>
-        <w:pStyle w:val="ListMain"/>
+        <w:pStyle w:val="ListParagraph"/>
+        <w:spacing w:line="360" w:lineRule="auto" w:before="0" w:after="0"/>
+        <w:ind w:firstLine="709"/>
         <w:jc w:val="both"/>
       </w:pPr>
       <w:r>
@@ -3521,12 +3888,14 @@
           <w:color w:val="000000"/>
           <w:sz w:val="28"/>
         </w:rPr>
-        <w:t>• Моделирование аварийной ситуации: случайное удаление записей или повреждение таблицы, восстановление БД из бэкапа (RESTORE DATABASE ... WITH REPLACE).</w:t>
+        <w:t>— Моделирование аварийной ситуации: случайное удаление записей или повреждение таблицы, восстановление БД из бэкапа (RESTORE DATABASE ... WITH REPLACE).</w:t>
       </w:r>
     </w:p>
     <w:p>
       <w:pPr>
-        <w:pStyle w:val="ListMain"/>
+        <w:pStyle w:val="ListParagraph"/>
+        <w:spacing w:line="360" w:lineRule="auto" w:before="0" w:after="0"/>
+        <w:ind w:firstLine="709"/>
         <w:jc w:val="both"/>
       </w:pPr>
       <w:r>
@@ -3536,12 +3905,14 @@
           <w:color w:val="000000"/>
           <w:sz w:val="28"/>
         </w:rPr>
-        <w:t>• Программная обработка потери связи с СУБД: перехват SqlException, вывод информативного диалога и алгоритм повторных попыток (Retry Logic).</w:t>
+        <w:t>— Программная обработка потери связи с СУБД: перехват SqlException, вывод информативного диалога и алгоритм повторных попыток (Retry Logic).</w:t>
       </w:r>
     </w:p>
     <w:p>
       <w:pPr>
-        <w:pStyle w:val="ListMain"/>
+        <w:pStyle w:val="ListParagraph"/>
+        <w:spacing w:line="360" w:lineRule="auto" w:before="0" w:after="0"/>
+        <w:ind w:firstLine="709"/>
         <w:jc w:val="both"/>
       </w:pPr>
       <w:r>
@@ -3551,12 +3922,14 @@
           <w:color w:val="000000"/>
           <w:sz w:val="28"/>
         </w:rPr>
-        <w:t>• Проверка целостности восстановленной базы данных командой DBCC CHECKDB.</w:t>
+        <w:t>— Проверка целостности восстановленной базы данных командой DBCC CHECKDB.</w:t>
       </w:r>
     </w:p>
     <w:p>
       <w:pPr>
-        <w:pStyle w:val="Headerlower"/>
+        <w:pStyle w:val="Heading2"/>
+        <w:spacing w:line="360" w:lineRule="auto" w:before="120" w:after="0"/>
+        <w:ind w:firstLine="709"/>
         <w:jc w:val="both"/>
       </w:pPr>
       <w:r>
@@ -3571,7 +3944,8 @@
     </w:p>
     <w:p>
       <w:pPr>
-        <w:pStyle w:val="Picturemain"/>
+        <w:spacing w:line="360" w:lineRule="auto" w:before="120" w:after="120"/>
+        <w:ind w:firstLine="0"/>
         <w:jc w:val="center"/>
       </w:pPr>
       <w:r>
@@ -3588,7 +3962,9 @@
     </w:p>
     <w:p>
       <w:pPr>
-        <w:pStyle w:val="Headerlower"/>
+        <w:pStyle w:val="Heading2"/>
+        <w:spacing w:line="360" w:lineRule="auto" w:before="120" w:after="0"/>
+        <w:ind w:firstLine="709"/>
         <w:jc w:val="both"/>
       </w:pPr>
       <w:r>
@@ -3603,7 +3979,8 @@
     </w:p>
     <w:p>
       <w:pPr>
-        <w:pStyle w:val="ParagraphMain"/>
+        <w:spacing w:line="360" w:lineRule="auto" w:before="0" w:after="0"/>
+        <w:ind w:firstLine="709"/>
         <w:jc w:val="both"/>
       </w:pPr>
       <w:r>
@@ -3618,8 +3995,10 @@
     </w:p>
     <w:p>
       <w:pPr>
-        <w:pStyle w:val="HeaderMain"/>
+        <w:pStyle w:val="Heading1"/>
         <w:pageBreakBefore/>
+        <w:spacing w:line="360" w:lineRule="auto" w:before="240" w:after="240"/>
+        <w:ind w:firstLine="0"/>
         <w:jc w:val="center"/>
       </w:pPr>
       <w:r>
@@ -3634,7 +4013,9 @@
     </w:p>
     <w:p>
       <w:pPr>
-        <w:pStyle w:val="Headerlower"/>
+        <w:pStyle w:val="Heading2"/>
+        <w:spacing w:line="360" w:lineRule="auto" w:before="120" w:after="0"/>
+        <w:ind w:firstLine="709"/>
         <w:jc w:val="both"/>
       </w:pPr>
       <w:r>
@@ -3649,7 +4030,8 @@
     </w:p>
     <w:p>
       <w:pPr>
-        <w:pStyle w:val="ParagraphMain"/>
+        <w:spacing w:line="360" w:lineRule="auto" w:before="0" w:after="0"/>
+        <w:ind w:firstLine="709"/>
         <w:jc w:val="both"/>
       </w:pPr>
       <w:r>
@@ -3664,7 +4046,9 @@
     </w:p>
     <w:p>
       <w:pPr>
-        <w:pStyle w:val="Headerlower"/>
+        <w:pStyle w:val="Heading2"/>
+        <w:spacing w:line="360" w:lineRule="auto" w:before="120" w:after="0"/>
+        <w:ind w:firstLine="709"/>
         <w:jc w:val="both"/>
       </w:pPr>
       <w:r>
@@ -3679,7 +4063,9 @@
     </w:p>
     <w:p>
       <w:pPr>
-        <w:pStyle w:val="ListMain"/>
+        <w:pStyle w:val="ListParagraph"/>
+        <w:spacing w:line="360" w:lineRule="auto" w:before="0" w:after="0"/>
+        <w:ind w:firstLine="709"/>
         <w:jc w:val="both"/>
       </w:pPr>
       <w:r>
@@ -3689,12 +4075,14 @@
           <w:color w:val="000000"/>
           <w:sz w:val="28"/>
         </w:rPr>
-        <w:t>• Комплектование итогового комплекта: титульный лист, аттестационный лист, дневник практики на 18 дней, отчет со сквозным описанием ИС.</w:t>
+        <w:t>— Комплектование итогового комплекта: титульный лист, аттестационный лист, дневник практики на 18 дней, отчет со сквозным описанием ИС.</w:t>
       </w:r>
     </w:p>
     <w:p>
       <w:pPr>
-        <w:pStyle w:val="ListMain"/>
+        <w:pStyle w:val="ListParagraph"/>
+        <w:spacing w:line="360" w:lineRule="auto" w:before="0" w:after="0"/>
+        <w:ind w:firstLine="709"/>
         <w:jc w:val="both"/>
       </w:pPr>
       <w:r>
@@ -3704,12 +4092,14 @@
           <w:color w:val="000000"/>
           <w:sz w:val="28"/>
         </w:rPr>
-        <w:t>• Оформление пояснительной записки в строгом соответствии с ГОСТ (Times New Roman 14 пт, интервал 1.15, нумерация рисунков, схемы ERD и XSD).</w:t>
+        <w:t>— Оформление пояснительной записки в строгом соответствии с ГОСТ (Times New Roman 14 пт, интервал 1.15, нумерация рисунков, схемы ERD и XSD).</w:t>
       </w:r>
     </w:p>
     <w:p>
       <w:pPr>
-        <w:pStyle w:val="ListMain"/>
+        <w:pStyle w:val="ListParagraph"/>
+        <w:spacing w:line="360" w:lineRule="auto" w:before="0" w:after="0"/>
+        <w:ind w:firstLine="709"/>
         <w:jc w:val="both"/>
       </w:pPr>
       <w:r>
@@ -3719,12 +4109,14 @@
           <w:color w:val="000000"/>
           <w:sz w:val="28"/>
         </w:rPr>
-        <w:t>• Подготовка демонстрационного сценария живой работы программного продукта (авторизация, Master-Detail, CRUD, поиск, бэкап).</w:t>
+        <w:t>— Подготовка демонстрационного сценария живой работы программного продукта (авторизация, Master-Detail, CRUD, поиск, бэкап).</w:t>
       </w:r>
     </w:p>
     <w:p>
       <w:pPr>
-        <w:pStyle w:val="ListMain"/>
+        <w:pStyle w:val="ListParagraph"/>
+        <w:spacing w:line="360" w:lineRule="auto" w:before="0" w:after="0"/>
+        <w:ind w:firstLine="709"/>
         <w:jc w:val="both"/>
       </w:pPr>
       <w:r>
@@ -3734,12 +4126,14 @@
           <w:color w:val="000000"/>
           <w:sz w:val="28"/>
         </w:rPr>
-        <w:t>• Успешная защита индивидуального проекта перед руководителем практики Карташовым Д. Г.</w:t>
+        <w:t>— Успешная защита индивидуального проекта перед руководителем практики Карташовым Д. Г.</w:t>
       </w:r>
     </w:p>
     <w:p>
       <w:pPr>
-        <w:pStyle w:val="Headerlower"/>
+        <w:pStyle w:val="Heading2"/>
+        <w:spacing w:line="360" w:lineRule="auto" w:before="120" w:after="0"/>
+        <w:ind w:firstLine="709"/>
         <w:jc w:val="both"/>
       </w:pPr>
       <w:r>
@@ -3754,7 +4148,8 @@
     </w:p>
     <w:p>
       <w:pPr>
-        <w:pStyle w:val="Picturemain"/>
+        <w:spacing w:line="360" w:lineRule="auto" w:before="120" w:after="120"/>
+        <w:ind w:firstLine="0"/>
         <w:jc w:val="center"/>
       </w:pPr>
       <w:r>
@@ -3771,7 +4166,9 @@
     </w:p>
     <w:p>
       <w:pPr>
-        <w:pStyle w:val="Headerlower"/>
+        <w:pStyle w:val="Heading2"/>
+        <w:spacing w:line="360" w:lineRule="auto" w:before="120" w:after="0"/>
+        <w:ind w:firstLine="709"/>
         <w:jc w:val="both"/>
       </w:pPr>
       <w:r>
@@ -3786,7 +4183,8 @@
     </w:p>
     <w:p>
       <w:pPr>
-        <w:pStyle w:val="ParagraphMain"/>
+        <w:spacing w:line="360" w:lineRule="auto" w:before="0" w:after="0"/>
+        <w:ind w:firstLine="709"/>
         <w:jc w:val="both"/>
       </w:pPr>
       <w:r>
@@ -3801,8 +4199,10 @@
     </w:p>
     <w:p>
       <w:pPr>
-        <w:pStyle w:val="HeaderMain"/>
+        <w:pStyle w:val="Heading1"/>
         <w:pageBreakBefore/>
+        <w:spacing w:line="360" w:lineRule="auto" w:before="240" w:after="240"/>
+        <w:ind w:firstLine="0"/>
         <w:jc w:val="center"/>
       </w:pPr>
       <w:r>
@@ -3817,7 +4217,8 @@
     </w:p>
     <w:p>
       <w:pPr>
-        <w:pStyle w:val="ParagraphMain"/>
+        <w:spacing w:line="360" w:lineRule="auto" w:before="0" w:after="0"/>
+        <w:ind w:firstLine="709"/>
         <w:jc w:val="both"/>
       </w:pPr>
       <w:r>
@@ -3832,7 +4233,8 @@
     </w:p>
     <w:p>
       <w:pPr>
-        <w:pStyle w:val="ParagraphMain"/>
+        <w:spacing w:line="360" w:lineRule="auto" w:before="0" w:after="0"/>
+        <w:ind w:firstLine="709"/>
         <w:jc w:val="both"/>
       </w:pPr>
       <w:r>
@@ -3847,7 +4249,9 @@
     </w:p>
     <w:p>
       <w:pPr>
-        <w:pStyle w:val="ListMain"/>
+        <w:pStyle w:val="ListParagraph"/>
+        <w:spacing w:line="360" w:lineRule="auto" w:before="0" w:after="0"/>
+        <w:ind w:firstLine="709"/>
         <w:jc w:val="both"/>
       </w:pPr>
       <w:r>
@@ -3857,12 +4261,14 @@
           <w:color w:val="000000"/>
           <w:sz w:val="28"/>
         </w:rPr>
-        <w:t>• Спроектирована и нормализована реляционная база данных, содержащая 6 взаимосвязанных сущностей с обеспечением целостности связей (Primary / Foreign Keys 1:N и N:M);</w:t>
+        <w:t>— Спроектирована и нормализована реляционная база данных, содержащая 6 взаимосвязанных сущностей с обеспечением целостности связей (Primary / Foreign Keys 1:N и N:M);</w:t>
       </w:r>
     </w:p>
     <w:p>
       <w:pPr>
-        <w:pStyle w:val="ListMain"/>
+        <w:pStyle w:val="ListParagraph"/>
+        <w:spacing w:line="360" w:lineRule="auto" w:before="0" w:after="0"/>
+        <w:ind w:firstLine="709"/>
         <w:jc w:val="both"/>
       </w:pPr>
       <w:r>
@@ -3872,12 +4278,14 @@
           <w:color w:val="000000"/>
           <w:sz w:val="28"/>
         </w:rPr>
-        <w:t>• Построен типизированный слой доступа к данным через визуальный дизайнер .xsd (Typed DataSet, DataTable, TableAdapter), обеспечивший типобезопасность и высокую скорость обработки данных;</w:t>
+        <w:t>— Построен типизированный слой доступа к данным через визуальный дизайнер .xsd (Typed DataSet, DataTable, TableAdapter), обеспечивший типобезопасность и высокую скорость обработки данных;</w:t>
       </w:r>
     </w:p>
     <w:p>
       <w:pPr>
-        <w:pStyle w:val="ListMain"/>
+        <w:pStyle w:val="ListParagraph"/>
+        <w:spacing w:line="360" w:lineRule="auto" w:before="0" w:after="0"/>
+        <w:ind w:firstLine="709"/>
         <w:jc w:val="both"/>
       </w:pPr>
       <w:r>
@@ -3887,12 +4295,14 @@
           <w:color w:val="000000"/>
           <w:sz w:val="28"/>
         </w:rPr>
-        <w:t>• Разработан современный графический интерфейс с компонентами Material3, реализующий Master-Detail связывание таблиц, фильтрацию RowFilter и полный цикл CRUD-операций;</w:t>
+        <w:t>— Разработан современный графический интерфейс с компонентами Material3, реализующий Master-Detail связывание таблиц, фильтрацию RowFilter и полный цикл CRUD-операций;</w:t>
       </w:r>
     </w:p>
     <w:p>
       <w:pPr>
-        <w:pStyle w:val="ListMain"/>
+        <w:pStyle w:val="ListParagraph"/>
+        <w:spacing w:line="360" w:lineRule="auto" w:before="0" w:after="0"/>
+        <w:ind w:firstLine="709"/>
         <w:jc w:val="both"/>
       </w:pPr>
       <w:r>
@@ -3902,12 +4312,14 @@
           <w:color w:val="000000"/>
           <w:sz w:val="28"/>
         </w:rPr>
-        <w:t>• Внедрена подсистема информационной безопасности: симметричное шифрование файлов AES-256 и безопасная аутентификация с хэшированием паролей SHA-256 с добавлением соли;</w:t>
+        <w:t>— Внедрена подсистема информационной безопасности: симметричное шифрование файлов AES-256 и безопасная аутентификация с хэшированием паролей SHA-256 с добавлением соли;</w:t>
       </w:r>
     </w:p>
     <w:p>
       <w:pPr>
-        <w:pStyle w:val="ListMain"/>
+        <w:pStyle w:val="ListParagraph"/>
+        <w:spacing w:line="360" w:lineRule="auto" w:before="0" w:after="0"/>
+        <w:ind w:firstLine="709"/>
         <w:jc w:val="both"/>
       </w:pPr>
       <w:r>
@@ -3917,12 +4329,14 @@
           <w:color w:val="000000"/>
           <w:sz w:val="28"/>
         </w:rPr>
-        <w:t>• Настроен версионный контроль в локальном Git-репозитории с практикой ветвления и разрешения конфликтов слияния;</w:t>
+        <w:t>— Настроен версионный контроль в локальном Git-репозитории с практикой ветвления и разрешения конфликтов слияния;</w:t>
       </w:r>
     </w:p>
     <w:p>
       <w:pPr>
-        <w:pStyle w:val="ListMain"/>
+        <w:pStyle w:val="ListParagraph"/>
+        <w:spacing w:line="360" w:lineRule="auto" w:before="0" w:after="0"/>
+        <w:ind w:firstLine="709"/>
         <w:jc w:val="both"/>
       </w:pPr>
       <w:r>
@@ -3932,12 +4346,13 @@
           <w:color w:val="000000"/>
           <w:sz w:val="28"/>
         </w:rPr>
-        <w:t>• Проведено тестирование производительности выборки данных (Stopwatch), стресс-тестирование оборудования и разработана подсистема резервного копирования и восстановления базы данных (.bak).</w:t>
+        <w:t>— Проведено тестирование производительности выборки данных (Stopwatch), стресс-тестирование оборудования и разработана подсистема резервного копирования и восстановления базы данных (.bak).</w:t>
       </w:r>
     </w:p>
     <w:p>
       <w:pPr>
-        <w:pStyle w:val="ParagraphMain"/>
+        <w:spacing w:line="360" w:lineRule="auto" w:before="0" w:after="0"/>
+        <w:ind w:firstLine="709"/>
         <w:jc w:val="both"/>
       </w:pPr>
       <w:r>
@@ -3951,13 +4366,53 @@
       </w:r>
     </w:p>
     <w:sectPr>
-      <w:pgSz w:w="11909" w:h="16834"/>
-      <w:pgMar w:top="1134" w:right="567" w:bottom="1134" w:left="1701" w:header="709" w:footer="709" w:gutter="0"/>
+      <w:footerReference w:type="default" ns2:id="rId97"/>
+      <w:pgSz w:w="11906" w:h="16838"/>
+      <w:pgMar w:top="1134" w:right="850" w:bottom="1134" w:left="1701" w:header="708" w:footer="708" w:gutter="0"/>
       <w:cols w:space="720"/>
       <w:docGrid w:linePitch="360"/>
     </w:sectPr>
   </w:body>
 </w:document>
+</file>
+
+<file path=word/footer1.xml><?xml version="1.0" encoding="utf-8"?>
+<w:ftr xmlns:m="http://schemas.openxmlformats.org/officeDocument/2006/math" xmlns:mc="http://schemas.openxmlformats.org/markup-compatibility/2006" xmlns:mo="http://schemas.microsoft.com/office/mac/office/2008/main" xmlns:mv="urn:schemas-microsoft-com:mac:vml" xmlns:o="urn:schemas-microsoft-com:office:office" xmlns:r="http://schemas.openxmlformats.org/officeDocument/2006/relationships" xmlns:v="urn:schemas-microsoft-com:vml" xmlns:w10="urn:schemas-microsoft-com:office:word" xmlns:w14="http://schemas.microsoft.com/office/word/2010/wordml" xmlns:w="http://schemas.openxmlformats.org/wordprocessingml/2006/main" xmlns:wne="http://schemas.microsoft.com/office/word/2006/wordml" xmlns:wp14="http://schemas.microsoft.com/office/word/2010/wordprocessingDrawing" xmlns:wp="http://schemas.openxmlformats.org/drawingml/2006/wordprocessingDrawing" xmlns:wpc="http://schemas.microsoft.com/office/word/2010/wordprocessingCanvas" xmlns:wpg="http://schemas.microsoft.com/office/word/2010/wordprocessingGroup" xmlns:wpi="http://schemas.microsoft.com/office/word/2010/wordprocessingInk" xmlns:wps="http://schemas.microsoft.com/office/word/2010/wordprocessingShape" mc:Ignorable="w14 wp14">
+  <w:p>
+    <w:pPr>
+      <w:pStyle w:val="Footer"/>
+      <w:jc w:val="center"/>
+    </w:pPr>
+    <w:r>
+      <w:rPr>
+        <w:rFonts w:ascii="Times New Roman" w:hAnsi="Times New Roman"/>
+        <w:sz w:val="28"/>
+      </w:rPr>
+      <w:fldChar w:fldCharType="begin"/>
+    </w:r>
+    <w:r>
+      <w:rPr>
+        <w:rFonts w:ascii="Times New Roman" w:hAnsi="Times New Roman"/>
+        <w:sz w:val="28"/>
+      </w:rPr>
+      <w:instrText xml:space="preserve"> PAGE </w:instrText>
+    </w:r>
+    <w:r>
+      <w:rPr>
+        <w:rFonts w:ascii="Times New Roman" w:hAnsi="Times New Roman"/>
+        <w:sz w:val="28"/>
+      </w:rPr>
+      <w:fldChar w:fldCharType="separate"/>
+    </w:r>
+    <w:r>
+      <w:rPr>
+        <w:rFonts w:ascii="Times New Roman" w:hAnsi="Times New Roman"/>
+        <w:sz w:val="28"/>
+      </w:rPr>
+      <w:fldChar w:fldCharType="end"/>
+    </w:r>
+  </w:p>
+</w:ftr>
 </file>
 
 <file path=word/numbering.xml><?xml version="1.0" encoding="utf-8"?>
@@ -4324,13 +4779,13 @@
     <w:qFormat/>
     <w:rsid w:val="00FC693F"/>
     <w:pPr>
-      <w:spacing w:line="360" w:lineRule="auto" w:after="80" w:before="0"/>
-      <w:ind w:firstLine="706"/>
+      <w:spacing w:line="360" w:lineRule="auto" w:after="0" w:before="0"/>
+      <w:ind w:firstLine="709"/>
       <w:jc w:val="both"/>
     </w:pPr>
     <w:rPr>
-      <w:rFonts w:ascii="Times New Roman" w:hAnsi="Times New Roman"/>
-      <w:color w:val="111827"/>
+      <w:rFonts w:ascii="Times New Roman" w:hAnsi="Times New Roman" w:cs="Times New Roman"/>
+      <w:color w:val="000000"/>
       <w:sz w:val="28"/>
     </w:rPr>
   </w:style>
@@ -15235,197 +15690,6 @@
         <w:shd w:val="clear" w:color="auto" w:fill="FBCAA2" w:themeFill="accent6" w:themeFillTint="7F"/>
       </w:tcPr>
     </w:tblStylePr>
-  </w:style>
-  <w:style w:type="paragraph" w:customStyle="1" w:styleId="Headerlower">
-    <w:name w:val="Header_lower"/>
-    <w:basedOn w:val="a"/>
-    <w:link w:val="Headerlower0"/>
-    <w:qFormat/>
-    <w:rsid w:val="00026BF1"/>
-    <w:pPr>
-      <w:spacing w:after="0" w:line="360" w:lineRule="auto"/>
-      <w:ind w:firstLine="709"/>
-      <w:jc w:val="both"/>
-      <w:outlineLvl w:val="1"/>
-    </w:pPr>
-    <w:rPr>
-      <w:rFonts w:ascii="Times New Roman" w:hAnsi="Times New Roman"/>
-      <w:noProof/>
-      <w:sz w:val="28"/>
-      <w:lang w:eastAsia="ru-RU"/>
-    </w:rPr>
-  </w:style>
-  <w:style w:type="character" w:customStyle="1" w:styleId="Headerlower0">
-    <w:name w:val="Header_lower Знак"/>
-    <w:basedOn w:val="a0"/>
-    <w:link w:val="Headerlower"/>
-    <w:rsid w:val="00026BF1"/>
-    <w:rPr>
-      <w:rFonts w:ascii="Times New Roman" w:hAnsi="Times New Roman"/>
-      <w:noProof/>
-      <w:sz w:val="28"/>
-      <w:lang w:eastAsia="ru-RU"/>
-    </w:rPr>
-  </w:style>
-  <w:style w:type="paragraph" w:customStyle="1" w:styleId="HeaderMain">
-    <w:name w:val="Header_Main"/>
-    <w:basedOn w:val="1"/>
-    <w:link w:val="HeaderMain0"/>
-    <w:qFormat/>
-    <w:rsid w:val="00C21F8E"/>
-    <w:pPr>
-      <w:spacing w:before="480" w:after="480" w:line="360" w:lineRule="auto"/>
-      <w:jc w:val="center"/>
-    </w:pPr>
-    <w:rPr>
-      <w:rFonts w:ascii="Times New Roman" w:hAnsi="Times New Roman"/>
-      <w:noProof/>
-      <w:color w:val="000000" w:themeColor="text1"/>
-      <w:lang w:eastAsia="ru-RU"/>
-      <w:sz w:val="28"/>
-    </w:rPr>
-  </w:style>
-  <w:style w:type="character" w:customStyle="1" w:styleId="HeaderMain0">
-    <w:name w:val="Header_Main Знак"/>
-    <w:basedOn w:val="10"/>
-    <w:link w:val="HeaderMain"/>
-    <w:rsid w:val="00C21F8E"/>
-    <w:rPr>
-      <w:rFonts w:ascii="Times New Roman" w:eastAsiaTheme="majorEastAsia" w:hAnsi="Times New Roman" w:cstheme="majorBidi"/>
-      <w:noProof/>
-      <w:color w:val="000000" w:themeColor="text1"/>
-      <w:sz w:val="28"/>
-      <w:szCs w:val="32"/>
-      <w:lang w:eastAsia="ru-RU"/>
-    </w:rPr>
-  </w:style>
-  <w:style w:type="paragraph" w:customStyle="1" w:styleId="ListMain">
-    <w:name w:val="List_Main"/>
-    <w:basedOn w:val="a"/>
-    <w:link w:val="ListMain0"/>
-    <w:qFormat/>
-    <w:rsid w:val="005F0F50"/>
-    <w:pPr>
-      <w:numPr>
-        <w:numId w:val="2"/>
-      </w:numPr>
-      <w:spacing w:after="0" w:line="360" w:lineRule="auto"/>
-      <w:jc w:val="both"/>
-    </w:pPr>
-    <w:rPr>
-      <w:rFonts w:ascii="Times New Roman" w:hAnsi="Times New Roman"/>
-      <w:sz w:val="28"/>
-    </w:rPr>
-  </w:style>
-  <w:style w:type="character" w:customStyle="1" w:styleId="ListMain0">
-    <w:name w:val="List_Main Знак"/>
-    <w:basedOn w:val="a0"/>
-    <w:link w:val="ListMain"/>
-    <w:rsid w:val="005F0F50"/>
-    <w:rPr>
-      <w:rFonts w:ascii="Times New Roman" w:hAnsi="Times New Roman"/>
-      <w:sz w:val="28"/>
-    </w:rPr>
-  </w:style>
-  <w:style w:type="paragraph" w:customStyle="1" w:styleId="Listnums">
-    <w:name w:val="List_nums"/>
-    <w:basedOn w:val="a"/>
-    <w:link w:val="Listnums0"/>
-    <w:qFormat/>
-    <w:rsid w:val="005F0F50"/>
-    <w:pPr>
-      <w:numPr>
-        <w:numId w:val="1"/>
-      </w:numPr>
-      <w:spacing w:after="0" w:line="360" w:lineRule="auto"/>
-      <w:jc w:val="both"/>
-    </w:pPr>
-    <w:rPr>
-      <w:rFonts w:ascii="Times New Roman" w:hAnsi="Times New Roman"/>
-      <w:sz w:val="28"/>
-    </w:rPr>
-  </w:style>
-  <w:style w:type="character" w:customStyle="1" w:styleId="Listnums0">
-    <w:name w:val="List_nums Знак"/>
-    <w:basedOn w:val="a0"/>
-    <w:link w:val="Listnums"/>
-    <w:rsid w:val="005F0F50"/>
-    <w:rPr>
-      <w:rFonts w:ascii="Times New Roman" w:hAnsi="Times New Roman"/>
-      <w:sz w:val="28"/>
-    </w:rPr>
-  </w:style>
-  <w:style w:type="paragraph" w:customStyle="1" w:styleId="ParagraphMain">
-    <w:name w:val="Paragraph_Main"/>
-    <w:basedOn w:val="a"/>
-    <w:link w:val="ParagraphMain0"/>
-    <w:qFormat/>
-    <w:rsid w:val="005F0F50"/>
-    <w:pPr>
-      <w:spacing w:after="0" w:line="360" w:lineRule="auto"/>
-      <w:ind w:firstLine="709"/>
-      <w:jc w:val="both"/>
-    </w:pPr>
-    <w:rPr>
-      <w:rFonts w:ascii="Times New Roman" w:hAnsi="Times New Roman"/>
-      <w:sz w:val="28"/>
-    </w:rPr>
-  </w:style>
-  <w:style w:type="character" w:customStyle="1" w:styleId="ParagraphMain0">
-    <w:name w:val="Paragraph_Main Знак"/>
-    <w:basedOn w:val="a0"/>
-    <w:link w:val="ParagraphMain"/>
-    <w:rsid w:val="005F0F50"/>
-    <w:rPr>
-      <w:rFonts w:ascii="Times New Roman" w:hAnsi="Times New Roman"/>
-      <w:sz w:val="28"/>
-    </w:rPr>
-  </w:style>
-  <w:style w:type="paragraph" w:customStyle="1" w:styleId="Picturemain">
-    <w:name w:val="Picture_main"/>
-    <w:basedOn w:val="a"/>
-    <w:link w:val="Picturemain0"/>
-    <w:qFormat/>
-    <w:rsid w:val="005F0F50"/>
-    <w:pPr>
-      <w:spacing w:line="360" w:lineRule="auto"/>
-      <w:ind w:firstLine="708"/>
-      <w:jc w:val="center"/>
-    </w:pPr>
-    <w:rPr>
-      <w:rFonts w:ascii="Times New Roman" w:hAnsi="Times New Roman"/>
-      <w:sz w:val="28"/>
-    </w:rPr>
-  </w:style>
-  <w:style w:type="character" w:customStyle="1" w:styleId="Picturemain0">
-    <w:name w:val="Picture_main Знак"/>
-    <w:basedOn w:val="a0"/>
-    <w:link w:val="Picturemain"/>
-    <w:rsid w:val="005F0F50"/>
-    <w:rPr>
-      <w:rFonts w:ascii="Times New Roman" w:hAnsi="Times New Roman"/>
-      <w:sz w:val="28"/>
-    </w:rPr>
-  </w:style>
-  <w:style w:type="paragraph" w:customStyle="1" w:styleId="Tableatext">
-    <w:name w:val="Table_a_text"/>
-    <w:basedOn w:val="ParagraphMain"/>
-    <w:link w:val="Tableatext0"/>
-    <w:qFormat/>
-    <w:rsid w:val="00CE2512"/>
-    <w:pPr>
-      <w:spacing w:before="420"/>
-    </w:pPr>
-  </w:style>
-  <w:style w:type="character" w:customStyle="1" w:styleId="Tableatext0">
-    <w:name w:val="Table_a_text Знак"/>
-    <w:basedOn w:val="ParagraphMain0"/>
-    <w:link w:val="Tableatext"/>
-    <w:rsid w:val="00CE2512"/>
-    <w:rPr>
-      <w:rFonts w:ascii="Times New Roman" w:hAnsi="Times New Roman"/>
-      <w:sz w:val="28"/>
-    </w:rPr>
   </w:style>
 </w:styles>
 </file>

</xml_diff>